<commit_message>
update docs bigdata and cloudtec
</commit_message>
<xml_diff>
--- a/teorico/big_data/entregable/PIAD-625_FORMATOALUMNOTRABAJOFINAL.docx
+++ b/teorico/big_data/entregable/PIAD-625_FORMATOALUMNOTRABAJOFINAL.docx
@@ -1074,7 +1074,42 @@
                               <w:rPr>
                                 <w:rFonts w:ascii="Arial" w:hAnsi="Arial" w:cs="Arial"/>
                                 <w:color w:val="000000" w:themeColor="text1"/>
-                                <w:lang w:val="en-US"/>
+                                <w:lang w:val="es-PE"/>
+                              </w:rPr>
+                            </w:pPr>
+                            <w:r>
+                              <w:rPr>
+                                <w:rFonts w:ascii="Arial" w:hAnsi="Arial" w:cs="Arial"/>
+                                <w:color w:val="000000" w:themeColor="text1"/>
+                                <w:lang w:val="es-PE"/>
+                              </w:rPr>
+                              <w:t>El plan de negocio del supermercado "</w:t>
+                            </w:r>
+                            <w:proofErr w:type="spellStart"/>
+                            <w:r>
+                              <w:rPr>
+                                <w:rFonts w:ascii="Arial" w:hAnsi="Arial" w:cs="Arial"/>
+                                <w:color w:val="000000" w:themeColor="text1"/>
+                                <w:lang w:val="es-PE"/>
+                              </w:rPr>
+                              <w:t>MercadoFresh</w:t>
+                            </w:r>
+                            <w:proofErr w:type="spellEnd"/>
+                            <w:r>
+                              <w:rPr>
+                                <w:rFonts w:ascii="Arial" w:hAnsi="Arial" w:cs="Arial"/>
+                                <w:color w:val="000000" w:themeColor="text1"/>
+                                <w:lang w:val="es-PE"/>
+                              </w:rPr>
+                              <w:t>" se enfrenta a una ausencia total de infraestructura tecnológica para gestionar el volumen, la velocidad y la variedad de datos que planea generar, lo cual representa una debilidad crítica en un mercado altamente competitivo. Esta carencia de un sistema de Big Data desde su concepción no garantiza la capacidad de análisis ni el aprovechamiento de la información, exponiendo a la empresa a una toma de decisiones basada en la intuición en lugar de en evidencia.</w:t>
+                            </w:r>
+                          </w:p>
+                          <w:p>
+                            <w:pPr>
+                              <w:rPr>
+                                <w:rFonts w:ascii="Arial" w:hAnsi="Arial" w:cs="Arial"/>
+                                <w:color w:val="000000" w:themeColor="text1"/>
+                                <w:lang w:val="es-PE"/>
                               </w:rPr>
                             </w:pPr>
                           </w:p>
@@ -1083,106 +1118,24 @@
                               <w:rPr>
                                 <w:rFonts w:ascii="Arial" w:hAnsi="Arial" w:cs="Arial"/>
                                 <w:color w:val="000000" w:themeColor="text1"/>
-                                <w:lang w:val="en-US"/>
+                                <w:lang w:val="es-PE"/>
                               </w:rPr>
                             </w:pPr>
+                            <w:r>
+                              <w:rPr>
+                                <w:rFonts w:ascii="Arial" w:hAnsi="Arial" w:cs="Arial"/>
+                                <w:color w:val="000000" w:themeColor="text1"/>
+                                <w:lang w:val="es-PE"/>
+                              </w:rPr>
+                              <w:t>Además, esta situación impide la integración y el análisis en tiempo real de datos cruciales provenientes de puntos de venta, programas de lealtad, sensores de inventario y comportamiento del cliente en línea. Esto limita severamente la capacidad para optimizar la cadena de suministro, personalizar las ofertas y responder ágilmente a las tendencias del mercado.</w:t>
+                            </w:r>
                           </w:p>
                           <w:p>
                             <w:pPr>
                               <w:rPr>
                                 <w:rFonts w:ascii="Arial" w:hAnsi="Arial" w:cs="Arial"/>
                                 <w:color w:val="000000" w:themeColor="text1"/>
-                                <w:lang w:val="en-US"/>
-                              </w:rPr>
-                            </w:pPr>
-                          </w:p>
-                          <w:p>
-                            <w:pPr>
-                              <w:rPr>
-                                <w:rFonts w:ascii="Arial" w:hAnsi="Arial" w:cs="Arial"/>
-                                <w:color w:val="000000" w:themeColor="text1"/>
-                                <w:lang w:val="en-US"/>
-                              </w:rPr>
-                            </w:pPr>
-                          </w:p>
-                          <w:p>
-                            <w:pPr>
-                              <w:rPr>
-                                <w:rFonts w:ascii="Arial" w:hAnsi="Arial" w:cs="Arial"/>
-                                <w:color w:val="000000" w:themeColor="text1"/>
-                                <w:lang w:val="en-US"/>
-                              </w:rPr>
-                            </w:pPr>
-                          </w:p>
-                          <w:p>
-                            <w:pPr>
-                              <w:rPr>
-                                <w:rFonts w:ascii="Arial" w:hAnsi="Arial" w:cs="Arial"/>
-                                <w:color w:val="000000" w:themeColor="text1"/>
-                                <w:lang w:val="en-US"/>
-                              </w:rPr>
-                            </w:pPr>
-                          </w:p>
-                          <w:p>
-                            <w:pPr>
-                              <w:rPr>
-                                <w:rFonts w:ascii="Arial" w:hAnsi="Arial" w:cs="Arial"/>
-                                <w:color w:val="000000" w:themeColor="text1"/>
-                                <w:lang w:val="en-US"/>
-                              </w:rPr>
-                            </w:pPr>
-                          </w:p>
-                          <w:p>
-                            <w:pPr>
-                              <w:rPr>
-                                <w:rFonts w:ascii="Arial" w:hAnsi="Arial" w:cs="Arial"/>
-                                <w:color w:val="000000" w:themeColor="text1"/>
-                                <w:lang w:val="en-US"/>
-                              </w:rPr>
-                            </w:pPr>
-                          </w:p>
-                          <w:p>
-                            <w:pPr>
-                              <w:rPr>
-                                <w:rFonts w:ascii="Arial" w:hAnsi="Arial" w:cs="Arial"/>
-                                <w:color w:val="000000" w:themeColor="text1"/>
-                                <w:lang w:val="en-US"/>
-                              </w:rPr>
-                            </w:pPr>
-                          </w:p>
-                          <w:p>
-                            <w:pPr>
-                              <w:rPr>
-                                <w:rFonts w:ascii="Arial" w:hAnsi="Arial" w:cs="Arial"/>
-                                <w:color w:val="000000" w:themeColor="text1"/>
-                                <w:lang w:val="en-US"/>
-                              </w:rPr>
-                            </w:pPr>
-                          </w:p>
-                          <w:p>
-                            <w:pPr>
-                              <w:rPr>
-                                <w:rFonts w:ascii="Arial" w:hAnsi="Arial" w:cs="Arial"/>
-                                <w:color w:val="000000" w:themeColor="text1"/>
-                                <w:lang w:val="en-US"/>
-                              </w:rPr>
-                            </w:pPr>
-                          </w:p>
-                          <w:p>
-                            <w:pPr>
-                              <w:rPr>
-                                <w:rFonts w:ascii="Arial" w:hAnsi="Arial" w:cs="Arial"/>
-                                <w:color w:val="000000" w:themeColor="text1"/>
-                                <w:lang w:val="en-US"/>
-                              </w:rPr>
-                            </w:pPr>
-                          </w:p>
-                          <w:p>
-                            <w:pPr>
-                              <w:rPr>
-                                <w:rFonts w:ascii="Arial" w:hAnsi="Arial" w:cs="Arial"/>
-                                <w:color w:val="000000" w:themeColor="text1"/>
-                                <w:lang w:val="en-US"/>
+                                <w:lang w:val="es-PE"/>
                               </w:rPr>
                             </w:pPr>
                           </w:p>
@@ -1220,7 +1173,42 @@
                         <w:rPr>
                           <w:rFonts w:ascii="Arial" w:hAnsi="Arial" w:cs="Arial"/>
                           <w:color w:val="000000" w:themeColor="text1"/>
-                          <w:lang w:val="en-US"/>
+                          <w:lang w:val="es-PE"/>
+                        </w:rPr>
+                      </w:pPr>
+                      <w:r>
+                        <w:rPr>
+                          <w:rFonts w:ascii="Arial" w:hAnsi="Arial" w:cs="Arial"/>
+                          <w:color w:val="000000" w:themeColor="text1"/>
+                          <w:lang w:val="es-PE"/>
+                        </w:rPr>
+                        <w:t>El plan de negocio del supermercado "</w:t>
+                      </w:r>
+                      <w:proofErr w:type="spellStart"/>
+                      <w:r>
+                        <w:rPr>
+                          <w:rFonts w:ascii="Arial" w:hAnsi="Arial" w:cs="Arial"/>
+                          <w:color w:val="000000" w:themeColor="text1"/>
+                          <w:lang w:val="es-PE"/>
+                        </w:rPr>
+                        <w:t>MercadoFresh</w:t>
+                      </w:r>
+                      <w:proofErr w:type="spellEnd"/>
+                      <w:r>
+                        <w:rPr>
+                          <w:rFonts w:ascii="Arial" w:hAnsi="Arial" w:cs="Arial"/>
+                          <w:color w:val="000000" w:themeColor="text1"/>
+                          <w:lang w:val="es-PE"/>
+                        </w:rPr>
+                        <w:t>" se enfrenta a una ausencia total de infraestructura tecnológica para gestionar el volumen, la velocidad y la variedad de datos que planea generar, lo cual representa una debilidad crítica en un mercado altamente competitivo. Esta carencia de un sistema de Big Data desde su concepción no garantiza la capacidad de análisis ni el aprovechamiento de la información, exponiendo a la empresa a una toma de decisiones basada en la intuición en lugar de en evidencia.</w:t>
+                      </w:r>
+                    </w:p>
+                    <w:p>
+                      <w:pPr>
+                        <w:rPr>
+                          <w:rFonts w:ascii="Arial" w:hAnsi="Arial" w:cs="Arial"/>
+                          <w:color w:val="000000" w:themeColor="text1"/>
+                          <w:lang w:val="es-PE"/>
                         </w:rPr>
                       </w:pPr>
                     </w:p>
@@ -1229,108 +1217,28 @@
                         <w:rPr>
                           <w:rFonts w:ascii="Arial" w:hAnsi="Arial" w:cs="Arial"/>
                           <w:color w:val="000000" w:themeColor="text1"/>
-                          <w:lang w:val="en-US"/>
+                          <w:lang w:val="es-PE"/>
                         </w:rPr>
                       </w:pPr>
+                      <w:r>
+                        <w:rPr>
+                          <w:rFonts w:ascii="Arial" w:hAnsi="Arial" w:cs="Arial"/>
+                          <w:color w:val="000000" w:themeColor="text1"/>
+                          <w:lang w:val="es-PE"/>
+                        </w:rPr>
+                        <w:t>Además, esta situación impide la integración y el análisis en tiempo real de datos cruciales provenientes de puntos de venta, programas de lealtad, sensores de inventario y comportamiento del cliente en línea. Esto limita severamente la capacidad para optimizar la cadena de suministro, personalizar las ofertas y responder ágilmente a las tendencias del mercado.</w:t>
+                      </w:r>
                     </w:p>
                     <w:p>
                       <w:pPr>
                         <w:rPr>
                           <w:rFonts w:ascii="Arial" w:hAnsi="Arial" w:cs="Arial"/>
                           <w:color w:val="000000" w:themeColor="text1"/>
-                          <w:lang w:val="en-US"/>
+                          <w:lang w:val="es-PE"/>
                         </w:rPr>
                       </w:pPr>
-                    </w:p>
-                    <w:p>
-                      <w:pPr>
-                        <w:rPr>
-                          <w:rFonts w:ascii="Arial" w:hAnsi="Arial" w:cs="Arial"/>
-                          <w:color w:val="000000" w:themeColor="text1"/>
-                          <w:lang w:val="en-US"/>
-                        </w:rPr>
-                      </w:pPr>
-                    </w:p>
-                    <w:p>
-                      <w:pPr>
-                        <w:rPr>
-                          <w:rFonts w:ascii="Arial" w:hAnsi="Arial" w:cs="Arial"/>
-                          <w:color w:val="000000" w:themeColor="text1"/>
-                          <w:lang w:val="en-US"/>
-                        </w:rPr>
-                      </w:pPr>
-                    </w:p>
-                    <w:p>
-                      <w:pPr>
-                        <w:rPr>
-                          <w:rFonts w:ascii="Arial" w:hAnsi="Arial" w:cs="Arial"/>
-                          <w:color w:val="000000" w:themeColor="text1"/>
-                          <w:lang w:val="en-US"/>
-                        </w:rPr>
-                      </w:pPr>
-                    </w:p>
-                    <w:p>
-                      <w:pPr>
-                        <w:rPr>
-                          <w:rFonts w:ascii="Arial" w:hAnsi="Arial" w:cs="Arial"/>
-                          <w:color w:val="000000" w:themeColor="text1"/>
-                          <w:lang w:val="en-US"/>
-                        </w:rPr>
-                      </w:pPr>
-                    </w:p>
-                    <w:p>
-                      <w:pPr>
-                        <w:rPr>
-                          <w:rFonts w:ascii="Arial" w:hAnsi="Arial" w:cs="Arial"/>
-                          <w:color w:val="000000" w:themeColor="text1"/>
-                          <w:lang w:val="en-US"/>
-                        </w:rPr>
-                      </w:pPr>
-                    </w:p>
-                    <w:p>
-                      <w:pPr>
-                        <w:rPr>
-                          <w:rFonts w:ascii="Arial" w:hAnsi="Arial" w:cs="Arial"/>
-                          <w:color w:val="000000" w:themeColor="text1"/>
-                          <w:lang w:val="en-US"/>
-                        </w:rPr>
-                      </w:pPr>
-                    </w:p>
-                    <w:p>
-                      <w:pPr>
-                        <w:rPr>
-                          <w:rFonts w:ascii="Arial" w:hAnsi="Arial" w:cs="Arial"/>
-                          <w:color w:val="000000" w:themeColor="text1"/>
-                          <w:lang w:val="en-US"/>
-                        </w:rPr>
-                      </w:pPr>
-                    </w:p>
-                    <w:p>
-                      <w:pPr>
-                        <w:rPr>
-                          <w:rFonts w:ascii="Arial" w:hAnsi="Arial" w:cs="Arial"/>
-                          <w:color w:val="000000" w:themeColor="text1"/>
-                          <w:lang w:val="en-US"/>
-                        </w:rPr>
-                      </w:pPr>
-                    </w:p>
-                    <w:p>
-                      <w:pPr>
-                        <w:rPr>
-                          <w:rFonts w:ascii="Arial" w:hAnsi="Arial" w:cs="Arial"/>
-                          <w:color w:val="000000" w:themeColor="text1"/>
-                          <w:lang w:val="en-US"/>
-                        </w:rPr>
-                      </w:pPr>
-                    </w:p>
-                    <w:p>
-                      <w:pPr>
-                        <w:rPr>
-                          <w:rFonts w:ascii="Arial" w:hAnsi="Arial" w:cs="Arial"/>
-                          <w:color w:val="000000" w:themeColor="text1"/>
-                          <w:lang w:val="en-US"/>
-                        </w:rPr>
-                      </w:pPr>
+                      <w:bookmarkStart w:id="1" w:name="_GoBack"/>
+                      <w:bookmarkEnd w:id="1"/>
                     </w:p>
                   </w:txbxContent>
                 </v:textbox>
@@ -1469,6 +1377,45 @@
                                 <w:color w:val="000000" w:themeColor="text1"/>
                               </w:rPr>
                             </w:pPr>
+                            <w:r>
+                              <w:rPr>
+                                <w:rFonts w:ascii="Arial" w:hAnsi="Arial" w:cs="Arial"/>
+                                <w:color w:val="000000" w:themeColor="text1"/>
+                              </w:rPr>
+                              <w:t xml:space="preserve">Para solucionar la problemática, se propone implementar una plataforma de datos unificada con </w:t>
+                            </w:r>
+                            <w:proofErr w:type="spellStart"/>
+                            <w:r>
+                              <w:rPr>
+                                <w:rFonts w:ascii="Arial" w:hAnsi="Arial" w:cs="Arial"/>
+                                <w:color w:val="000000" w:themeColor="text1"/>
+                              </w:rPr>
+                              <w:t>Databricks</w:t>
+                            </w:r>
+                            <w:proofErr w:type="spellEnd"/>
+                            <w:r>
+                              <w:rPr>
+                                <w:rFonts w:ascii="Arial" w:hAnsi="Arial" w:cs="Arial"/>
+                                <w:color w:val="000000" w:themeColor="text1"/>
+                              </w:rPr>
+                              <w:t xml:space="preserve"> para construir una arquitectura </w:t>
+                            </w:r>
+                            <w:proofErr w:type="spellStart"/>
+                            <w:r>
+                              <w:rPr>
+                                <w:rFonts w:ascii="Arial" w:hAnsi="Arial" w:cs="Arial"/>
+                                <w:color w:val="000000" w:themeColor="text1"/>
+                              </w:rPr>
+                              <w:t>Lakehouse</w:t>
+                            </w:r>
+                            <w:proofErr w:type="spellEnd"/>
+                            <w:r>
+                              <w:rPr>
+                                <w:rFonts w:ascii="Arial" w:hAnsi="Arial" w:cs="Arial"/>
+                                <w:color w:val="000000" w:themeColor="text1"/>
+                              </w:rPr>
+                              <w:t xml:space="preserve"> que centralice y procese eficientemente toda la información del supermercado. Esta solución reemplazará la toma de decisiones intuitiva por una estrategia basada en evidencia. </w:t>
+                            </w:r>
                           </w:p>
                           <w:p>
                             <w:pPr>
@@ -1485,86 +1432,61 @@
                                 <w:color w:val="000000" w:themeColor="text1"/>
                               </w:rPr>
                             </w:pPr>
-                          </w:p>
-                          <w:p>
-                            <w:pPr>
+                            <w:r>
                               <w:rPr>
                                 <w:rFonts w:ascii="Arial" w:hAnsi="Arial" w:cs="Arial"/>
                                 <w:color w:val="000000" w:themeColor="text1"/>
                               </w:rPr>
-                            </w:pPr>
-                          </w:p>
-                          <w:p>
-                            <w:pPr>
+                              <w:t xml:space="preserve">Como evidencia concreta de su aplicación, se crearán tablas en Delta Lake que podrán ser consultadas en tiempo real mediante SQL, y se diseñará un </w:t>
+                            </w:r>
+                            <w:proofErr w:type="spellStart"/>
+                            <w:r>
                               <w:rPr>
                                 <w:rFonts w:ascii="Arial" w:hAnsi="Arial" w:cs="Arial"/>
                                 <w:color w:val="000000" w:themeColor="text1"/>
                               </w:rPr>
-                            </w:pPr>
-                          </w:p>
-                          <w:p>
-                            <w:pPr>
+                              <w:t>dashboard</w:t>
+                            </w:r>
+                            <w:proofErr w:type="spellEnd"/>
+                            <w:r>
                               <w:rPr>
                                 <w:rFonts w:ascii="Arial" w:hAnsi="Arial" w:cs="Arial"/>
                                 <w:color w:val="000000" w:themeColor="text1"/>
                               </w:rPr>
-                            </w:pPr>
-                          </w:p>
-                          <w:p>
-                            <w:pPr>
+                              <w:t xml:space="preserve"> de inteligencia de negocio (BI) que visualice métricas clave como el rendimiento de ventas por categoría y la gestión de inventario. Esto garantiza la trazabilidad de los datos y proporciona a la gerencia acceso inmediato a </w:t>
+                            </w:r>
+                            <w:proofErr w:type="spellStart"/>
+                            <w:r>
                               <w:rPr>
                                 <w:rFonts w:ascii="Arial" w:hAnsi="Arial" w:cs="Arial"/>
                                 <w:color w:val="000000" w:themeColor="text1"/>
                               </w:rPr>
-                            </w:pPr>
-                          </w:p>
-                          <w:p>
-                            <w:pPr>
+                              <w:t>insights</w:t>
+                            </w:r>
+                            <w:proofErr w:type="spellEnd"/>
+                            <w:r>
                               <w:rPr>
                                 <w:rFonts w:ascii="Arial" w:hAnsi="Arial" w:cs="Arial"/>
                                 <w:color w:val="000000" w:themeColor="text1"/>
                               </w:rPr>
-                            </w:pPr>
-                          </w:p>
-                          <w:p>
-                            <w:pPr>
+                              <w:t xml:space="preserve"> accionables, mejorando drásticamente la capacidad de toma de decisiones estratégicas de "</w:t>
+                            </w:r>
+                            <w:proofErr w:type="spellStart"/>
+                            <w:r>
                               <w:rPr>
                                 <w:rFonts w:ascii="Arial" w:hAnsi="Arial" w:cs="Arial"/>
                                 <w:color w:val="000000" w:themeColor="text1"/>
                               </w:rPr>
-                            </w:pPr>
-                          </w:p>
-                          <w:p>
-                            <w:pPr>
+                              <w:t>MercadoFresh</w:t>
+                            </w:r>
+                            <w:proofErr w:type="spellEnd"/>
+                            <w:r>
                               <w:rPr>
                                 <w:rFonts w:ascii="Arial" w:hAnsi="Arial" w:cs="Arial"/>
                                 <w:color w:val="000000" w:themeColor="text1"/>
                               </w:rPr>
-                            </w:pPr>
-                          </w:p>
-                          <w:p>
-                            <w:pPr>
-                              <w:rPr>
-                                <w:rFonts w:ascii="Arial" w:hAnsi="Arial" w:cs="Arial"/>
-                                <w:color w:val="000000" w:themeColor="text1"/>
-                              </w:rPr>
-                            </w:pPr>
-                          </w:p>
-                          <w:p>
-                            <w:pPr>
-                              <w:rPr>
-                                <w:rFonts w:ascii="Arial" w:hAnsi="Arial" w:cs="Arial"/>
-                                <w:color w:val="000000" w:themeColor="text1"/>
-                              </w:rPr>
-                            </w:pPr>
-                          </w:p>
-                          <w:p>
-                            <w:pPr>
-                              <w:rPr>
-                                <w:rFonts w:ascii="Arial" w:hAnsi="Arial" w:cs="Arial"/>
-                                <w:color w:val="000000" w:themeColor="text1"/>
-                              </w:rPr>
-                            </w:pPr>
+                              <w:t>".</w:t>
+                            </w:r>
                           </w:p>
                           <w:p>
                             <w:pPr>
@@ -1609,6 +1531,45 @@
                           <w:color w:val="000000" w:themeColor="text1"/>
                         </w:rPr>
                       </w:pPr>
+                      <w:r>
+                        <w:rPr>
+                          <w:rFonts w:ascii="Arial" w:hAnsi="Arial" w:cs="Arial"/>
+                          <w:color w:val="000000" w:themeColor="text1"/>
+                        </w:rPr>
+                        <w:t xml:space="preserve">Para solucionar la problemática, se propone implementar una plataforma de datos unificada con </w:t>
+                      </w:r>
+                      <w:proofErr w:type="spellStart"/>
+                      <w:r>
+                        <w:rPr>
+                          <w:rFonts w:ascii="Arial" w:hAnsi="Arial" w:cs="Arial"/>
+                          <w:color w:val="000000" w:themeColor="text1"/>
+                        </w:rPr>
+                        <w:t>Databricks</w:t>
+                      </w:r>
+                      <w:proofErr w:type="spellEnd"/>
+                      <w:r>
+                        <w:rPr>
+                          <w:rFonts w:ascii="Arial" w:hAnsi="Arial" w:cs="Arial"/>
+                          <w:color w:val="000000" w:themeColor="text1"/>
+                        </w:rPr>
+                        <w:t xml:space="preserve"> para construir una arquitectura </w:t>
+                      </w:r>
+                      <w:proofErr w:type="spellStart"/>
+                      <w:r>
+                        <w:rPr>
+                          <w:rFonts w:ascii="Arial" w:hAnsi="Arial" w:cs="Arial"/>
+                          <w:color w:val="000000" w:themeColor="text1"/>
+                        </w:rPr>
+                        <w:t>Lakehouse</w:t>
+                      </w:r>
+                      <w:proofErr w:type="spellEnd"/>
+                      <w:r>
+                        <w:rPr>
+                          <w:rFonts w:ascii="Arial" w:hAnsi="Arial" w:cs="Arial"/>
+                          <w:color w:val="000000" w:themeColor="text1"/>
+                        </w:rPr>
+                        <w:t xml:space="preserve"> que centralice y procese eficientemente toda la información del supermercado. Esta solución reemplazará la toma de decisiones intuitiva por una estrategia basada en evidencia. </w:t>
+                      </w:r>
                     </w:p>
                     <w:p>
                       <w:pPr>
@@ -1625,86 +1586,61 @@
                           <w:color w:val="000000" w:themeColor="text1"/>
                         </w:rPr>
                       </w:pPr>
-                    </w:p>
-                    <w:p>
-                      <w:pPr>
+                      <w:r>
                         <w:rPr>
                           <w:rFonts w:ascii="Arial" w:hAnsi="Arial" w:cs="Arial"/>
                           <w:color w:val="000000" w:themeColor="text1"/>
                         </w:rPr>
-                      </w:pPr>
-                    </w:p>
-                    <w:p>
-                      <w:pPr>
+                        <w:t xml:space="preserve">Como evidencia concreta de su aplicación, se crearán tablas en Delta Lake que podrán ser consultadas en tiempo real mediante SQL, y se diseñará un </w:t>
+                      </w:r>
+                      <w:proofErr w:type="spellStart"/>
+                      <w:r>
                         <w:rPr>
                           <w:rFonts w:ascii="Arial" w:hAnsi="Arial" w:cs="Arial"/>
                           <w:color w:val="000000" w:themeColor="text1"/>
                         </w:rPr>
-                      </w:pPr>
-                    </w:p>
-                    <w:p>
-                      <w:pPr>
+                        <w:t>dashboard</w:t>
+                      </w:r>
+                      <w:proofErr w:type="spellEnd"/>
+                      <w:r>
                         <w:rPr>
                           <w:rFonts w:ascii="Arial" w:hAnsi="Arial" w:cs="Arial"/>
                           <w:color w:val="000000" w:themeColor="text1"/>
                         </w:rPr>
-                      </w:pPr>
-                    </w:p>
-                    <w:p>
-                      <w:pPr>
+                        <w:t xml:space="preserve"> de inteligencia de negocio (BI) que visualice métricas clave como el rendimiento de ventas por categoría y la gestión de inventario. Esto garantiza la trazabilidad de los datos y proporciona a la gerencia acceso inmediato a </w:t>
+                      </w:r>
+                      <w:proofErr w:type="spellStart"/>
+                      <w:r>
                         <w:rPr>
                           <w:rFonts w:ascii="Arial" w:hAnsi="Arial" w:cs="Arial"/>
                           <w:color w:val="000000" w:themeColor="text1"/>
                         </w:rPr>
-                      </w:pPr>
-                    </w:p>
-                    <w:p>
-                      <w:pPr>
+                        <w:t>insights</w:t>
+                      </w:r>
+                      <w:proofErr w:type="spellEnd"/>
+                      <w:r>
                         <w:rPr>
                           <w:rFonts w:ascii="Arial" w:hAnsi="Arial" w:cs="Arial"/>
                           <w:color w:val="000000" w:themeColor="text1"/>
                         </w:rPr>
-                      </w:pPr>
-                    </w:p>
-                    <w:p>
-                      <w:pPr>
+                        <w:t xml:space="preserve"> accionables, mejorando drásticamente la capacidad de toma de decisiones estratégicas de "</w:t>
+                      </w:r>
+                      <w:proofErr w:type="spellStart"/>
+                      <w:r>
                         <w:rPr>
                           <w:rFonts w:ascii="Arial" w:hAnsi="Arial" w:cs="Arial"/>
                           <w:color w:val="000000" w:themeColor="text1"/>
                         </w:rPr>
-                      </w:pPr>
-                    </w:p>
-                    <w:p>
-                      <w:pPr>
+                        <w:t>MercadoFresh</w:t>
+                      </w:r>
+                      <w:proofErr w:type="spellEnd"/>
+                      <w:r>
                         <w:rPr>
                           <w:rFonts w:ascii="Arial" w:hAnsi="Arial" w:cs="Arial"/>
                           <w:color w:val="000000" w:themeColor="text1"/>
                         </w:rPr>
-                      </w:pPr>
-                    </w:p>
-                    <w:p>
-                      <w:pPr>
-                        <w:rPr>
-                          <w:rFonts w:ascii="Arial" w:hAnsi="Arial" w:cs="Arial"/>
-                          <w:color w:val="000000" w:themeColor="text1"/>
-                        </w:rPr>
-                      </w:pPr>
-                    </w:p>
-                    <w:p>
-                      <w:pPr>
-                        <w:rPr>
-                          <w:rFonts w:ascii="Arial" w:hAnsi="Arial" w:cs="Arial"/>
-                          <w:color w:val="000000" w:themeColor="text1"/>
-                        </w:rPr>
-                      </w:pPr>
-                    </w:p>
-                    <w:p>
-                      <w:pPr>
-                        <w:rPr>
-                          <w:rFonts w:ascii="Arial" w:hAnsi="Arial" w:cs="Arial"/>
-                          <w:color w:val="000000" w:themeColor="text1"/>
-                        </w:rPr>
-                      </w:pPr>
+                        <w:t>".</w:t>
+                      </w:r>
                     </w:p>
                     <w:p>
                       <w:pPr>
@@ -1989,25 +1925,7 @@
                 <w:szCs w:val="20"/>
                 <w:lang w:val="es-PE"/>
               </w:rPr>
-              <w:t xml:space="preserve">¿Cuáles son las principales fuentes de datos masivos en </w:t>
-            </w:r>
-            <w:r>
-              <w:rPr>
-                <w:rFonts w:ascii="Arial" w:hAnsi="Arial" w:cs="Arial"/>
-                <w:sz w:val="20"/>
-                <w:szCs w:val="20"/>
-                <w:lang w:val="es-PE"/>
-              </w:rPr>
-              <w:t>el supermercado</w:t>
-            </w:r>
-            <w:r>
-              <w:rPr>
-                <w:rFonts w:ascii="Arial" w:hAnsi="Arial" w:cs="Arial"/>
-                <w:sz w:val="20"/>
-                <w:szCs w:val="20"/>
-                <w:lang w:val="es-PE"/>
-              </w:rPr>
-              <w:t xml:space="preserve"> y cómo pueden ser gestionadas de manera eficiente?</w:t>
+              <w:t>¿Cuáles son las principales fuentes de datos masivos en el supermercado y cómo pueden ser gestionadas de manera eficiente?</w:t>
             </w:r>
           </w:p>
         </w:tc>
@@ -2040,6 +1958,148 @@
                 <w:lang w:val="es-PE"/>
               </w:rPr>
             </w:pPr>
+            <w:r>
+              <w:rPr>
+                <w:rFonts w:ascii="Arial" w:hAnsi="Arial" w:cs="Arial"/>
+                <w:sz w:val="20"/>
+                <w:szCs w:val="20"/>
+                <w:lang w:val="es-PE"/>
+              </w:rPr>
+              <w:t>Las principales fuentes de datos masivos en "</w:t>
+            </w:r>
+            <w:proofErr w:type="spellStart"/>
+            <w:r>
+              <w:rPr>
+                <w:rFonts w:ascii="Arial" w:hAnsi="Arial" w:cs="Arial"/>
+                <w:sz w:val="20"/>
+                <w:szCs w:val="20"/>
+                <w:lang w:val="es-PE"/>
+              </w:rPr>
+              <w:t>MercadoFresh</w:t>
+            </w:r>
+            <w:proofErr w:type="spellEnd"/>
+            <w:r>
+              <w:rPr>
+                <w:rFonts w:ascii="Arial" w:hAnsi="Arial" w:cs="Arial"/>
+                <w:sz w:val="20"/>
+                <w:szCs w:val="20"/>
+                <w:lang w:val="es-PE"/>
+              </w:rPr>
+              <w:t>" incluyen transacciones de los sistemas POS, historiales de compra del programa de lealtad, datos de navegación en la plataforma de e-</w:t>
+            </w:r>
+            <w:proofErr w:type="spellStart"/>
+            <w:r>
+              <w:rPr>
+                <w:rFonts w:ascii="Arial" w:hAnsi="Arial" w:cs="Arial"/>
+                <w:sz w:val="20"/>
+                <w:szCs w:val="20"/>
+                <w:lang w:val="es-PE"/>
+              </w:rPr>
+              <w:t>commerce</w:t>
+            </w:r>
+            <w:proofErr w:type="spellEnd"/>
+            <w:r>
+              <w:rPr>
+                <w:rFonts w:ascii="Arial" w:hAnsi="Arial" w:cs="Arial"/>
+                <w:sz w:val="20"/>
+                <w:szCs w:val="20"/>
+                <w:lang w:val="es-PE"/>
+              </w:rPr>
+              <w:t xml:space="preserve">, información de sensores </w:t>
+            </w:r>
+            <w:proofErr w:type="spellStart"/>
+            <w:r>
+              <w:rPr>
+                <w:rFonts w:ascii="Arial" w:hAnsi="Arial" w:cs="Arial"/>
+                <w:sz w:val="20"/>
+                <w:szCs w:val="20"/>
+                <w:lang w:val="es-PE"/>
+              </w:rPr>
+              <w:t>IoT</w:t>
+            </w:r>
+            <w:proofErr w:type="spellEnd"/>
+            <w:r>
+              <w:rPr>
+                <w:rFonts w:ascii="Arial" w:hAnsi="Arial" w:cs="Arial"/>
+                <w:sz w:val="20"/>
+                <w:szCs w:val="20"/>
+                <w:lang w:val="es-PE"/>
+              </w:rPr>
+              <w:t xml:space="preserve"> en estanterías y comentarios no estructurados de redes sociales. </w:t>
+            </w:r>
+          </w:p>
+          <w:p>
+            <w:pPr>
+              <w:spacing w:before="120"/>
+              <w:ind w:left="284"/>
+              <w:rPr>
+                <w:rFonts w:ascii="Arial" w:hAnsi="Arial" w:cs="Arial"/>
+                <w:sz w:val="20"/>
+                <w:szCs w:val="20"/>
+                <w:lang w:val="es-PE"/>
+              </w:rPr>
+            </w:pPr>
+            <w:r>
+              <w:rPr>
+                <w:rFonts w:ascii="Arial" w:hAnsi="Arial" w:cs="Arial"/>
+                <w:sz w:val="20"/>
+                <w:szCs w:val="20"/>
+                <w:lang w:val="es-PE"/>
+              </w:rPr>
+              <w:t xml:space="preserve">Para gestionar eficientemente esta complejidad, es crucial centralizar toda la información en una arquitectura </w:t>
+            </w:r>
+            <w:proofErr w:type="spellStart"/>
+            <w:r>
+              <w:rPr>
+                <w:rFonts w:ascii="Arial" w:hAnsi="Arial" w:cs="Arial"/>
+                <w:sz w:val="20"/>
+                <w:szCs w:val="20"/>
+                <w:lang w:val="es-PE"/>
+              </w:rPr>
+              <w:t>Lakehouse</w:t>
+            </w:r>
+            <w:proofErr w:type="spellEnd"/>
+            <w:r>
+              <w:rPr>
+                <w:rFonts w:ascii="Arial" w:hAnsi="Arial" w:cs="Arial"/>
+                <w:sz w:val="20"/>
+                <w:szCs w:val="20"/>
+                <w:lang w:val="es-PE"/>
+              </w:rPr>
+              <w:t xml:space="preserve"> moderna, implementada sobre una plataforma como </w:t>
+            </w:r>
+            <w:proofErr w:type="spellStart"/>
+            <w:r>
+              <w:rPr>
+                <w:rFonts w:ascii="Arial" w:hAnsi="Arial" w:cs="Arial"/>
+                <w:sz w:val="20"/>
+                <w:szCs w:val="20"/>
+                <w:lang w:val="es-PE"/>
+              </w:rPr>
+              <w:t>Databricks</w:t>
+            </w:r>
+            <w:proofErr w:type="spellEnd"/>
+            <w:r>
+              <w:rPr>
+                <w:rFonts w:ascii="Arial" w:hAnsi="Arial" w:cs="Arial"/>
+                <w:sz w:val="20"/>
+                <w:szCs w:val="20"/>
+                <w:lang w:val="es-PE"/>
+              </w:rPr>
+              <w:t>. Mediante pipelines de datos (ETL/ELT), esta información se ingiere, se limpia y se organiza en tablas confiables, creando una única fuente de la verdad, accesible y lista para un análisis profundo y unificado.</w:t>
+            </w:r>
+          </w:p>
+          <w:p>
+            <w:pPr>
+              <w:spacing w:before="120"/>
+              <w:ind w:left="284"/>
+              <w:rPr>
+                <w:rFonts w:ascii="Arial" w:hAnsi="Arial" w:cs="Arial"/>
+                <w:sz w:val="20"/>
+                <w:szCs w:val="20"/>
+                <w:lang w:val="es-PE"/>
+              </w:rPr>
+            </w:pPr>
           </w:p>
         </w:tc>
       </w:tr>
@@ -2181,6 +2241,108 @@
               </w:rPr>
               <w:t> </w:t>
             </w:r>
+            <w:r>
+              <w:rPr>
+                <w:rFonts w:ascii="Arial" w:hAnsi="Arial" w:cs="Arial"/>
+                <w:sz w:val="20"/>
+                <w:szCs w:val="20"/>
+                <w:lang w:val="es-PE"/>
+              </w:rPr>
+              <w:t xml:space="preserve">Los sistemas tradicionales como los Data </w:t>
+            </w:r>
+            <w:proofErr w:type="spellStart"/>
+            <w:r>
+              <w:rPr>
+                <w:rFonts w:ascii="Arial" w:hAnsi="Arial" w:cs="Arial"/>
+                <w:sz w:val="20"/>
+                <w:szCs w:val="20"/>
+                <w:lang w:val="es-PE"/>
+              </w:rPr>
+              <w:t>Warehouses</w:t>
+            </w:r>
+            <w:proofErr w:type="spellEnd"/>
+            <w:r>
+              <w:rPr>
+                <w:rFonts w:ascii="Arial" w:hAnsi="Arial" w:cs="Arial"/>
+                <w:sz w:val="20"/>
+                <w:szCs w:val="20"/>
+                <w:lang w:val="es-PE"/>
+              </w:rPr>
+              <w:t xml:space="preserve"> ofrecen estructura para datos de ventas pero son rígidos y costosos, mientras que los Data </w:t>
+            </w:r>
+            <w:proofErr w:type="spellStart"/>
+            <w:r>
+              <w:rPr>
+                <w:rFonts w:ascii="Arial" w:hAnsi="Arial" w:cs="Arial"/>
+                <w:sz w:val="20"/>
+                <w:szCs w:val="20"/>
+                <w:lang w:val="es-PE"/>
+              </w:rPr>
+              <w:t>Lakes</w:t>
+            </w:r>
+            <w:proofErr w:type="spellEnd"/>
+            <w:r>
+              <w:rPr>
+                <w:rFonts w:ascii="Arial" w:hAnsi="Arial" w:cs="Arial"/>
+                <w:sz w:val="20"/>
+                <w:szCs w:val="20"/>
+                <w:lang w:val="es-PE"/>
+              </w:rPr>
+              <w:t xml:space="preserve">, aunque flexibles y económicos, corren el riesgo de volverse desorganizados y poco confiables. La ventaja principal del enfoque propuesto, la arquitectura </w:t>
+            </w:r>
+            <w:proofErr w:type="spellStart"/>
+            <w:r>
+              <w:rPr>
+                <w:rFonts w:ascii="Arial" w:hAnsi="Arial" w:cs="Arial"/>
+                <w:sz w:val="20"/>
+                <w:szCs w:val="20"/>
+                <w:lang w:val="es-PE"/>
+              </w:rPr>
+              <w:t>Lakehouse</w:t>
+            </w:r>
+            <w:proofErr w:type="spellEnd"/>
+            <w:r>
+              <w:rPr>
+                <w:rFonts w:ascii="Arial" w:hAnsi="Arial" w:cs="Arial"/>
+                <w:sz w:val="20"/>
+                <w:szCs w:val="20"/>
+                <w:lang w:val="es-PE"/>
+              </w:rPr>
+              <w:t xml:space="preserve">, es que fusiona lo mejor de ambos mundos. </w:t>
+            </w:r>
+          </w:p>
+          <w:p>
+            <w:pPr>
+              <w:spacing w:before="120"/>
+              <w:ind w:left="284"/>
+              <w:rPr>
+                <w:rFonts w:ascii="Arial" w:hAnsi="Arial" w:cs="Arial"/>
+                <w:sz w:val="20"/>
+                <w:szCs w:val="20"/>
+                <w:lang w:val="es-PE"/>
+              </w:rPr>
+            </w:pPr>
+            <w:r>
+              <w:rPr>
+                <w:rFonts w:ascii="Arial" w:hAnsi="Arial" w:cs="Arial"/>
+                <w:sz w:val="20"/>
+                <w:szCs w:val="20"/>
+                <w:lang w:val="es-PE"/>
+              </w:rPr>
+              <w:t>Proporciona la flexibilidad de almacenamiento de bajo costo de un lago de datos para todo tipo de información, junto con las garantías de fiabilidad, rendimiento y gobernanza de datos de un almacén tradicional. Implementado con tecnologías como Delta Lake, asegura la calidad y consistencia de los datos, siendo la opción más equilibrada, escalable y estratégicamente sólida para el supermercado.</w:t>
+            </w:r>
+          </w:p>
+          <w:p>
+            <w:pPr>
+              <w:spacing w:before="120"/>
+              <w:ind w:left="284"/>
+              <w:rPr>
+                <w:rFonts w:ascii="Arial" w:hAnsi="Arial" w:cs="Arial"/>
+                <w:sz w:val="20"/>
+                <w:szCs w:val="20"/>
+                <w:lang w:val="es-PE"/>
+              </w:rPr>
+            </w:pPr>
           </w:p>
         </w:tc>
       </w:tr>
@@ -2316,6 +2478,168 @@
               </w:rPr>
               <w:t> </w:t>
             </w:r>
+            <w:r>
+              <w:rPr>
+                <w:rFonts w:ascii="Arial" w:hAnsi="Arial" w:cs="Arial"/>
+                <w:sz w:val="20"/>
+                <w:szCs w:val="20"/>
+                <w:lang w:val="es-PE"/>
+              </w:rPr>
+              <w:t xml:space="preserve">El </w:t>
+            </w:r>
+            <w:proofErr w:type="spellStart"/>
+            <w:r>
+              <w:rPr>
+                <w:rFonts w:ascii="Arial" w:hAnsi="Arial" w:cs="Arial"/>
+                <w:sz w:val="20"/>
+                <w:szCs w:val="20"/>
+                <w:lang w:val="es-PE"/>
+              </w:rPr>
+              <w:t>framework</w:t>
+            </w:r>
+            <w:proofErr w:type="spellEnd"/>
+            <w:r>
+              <w:rPr>
+                <w:rFonts w:ascii="Arial" w:hAnsi="Arial" w:cs="Arial"/>
+                <w:sz w:val="20"/>
+                <w:szCs w:val="20"/>
+                <w:lang w:val="es-PE"/>
+              </w:rPr>
+              <w:t xml:space="preserve"> de procesamiento de datos más adecuado para "</w:t>
+            </w:r>
+            <w:proofErr w:type="spellStart"/>
+            <w:r>
+              <w:rPr>
+                <w:rFonts w:ascii="Arial" w:hAnsi="Arial" w:cs="Arial"/>
+                <w:sz w:val="20"/>
+                <w:szCs w:val="20"/>
+                <w:lang w:val="es-PE"/>
+              </w:rPr>
+              <w:t>MercadoFresh</w:t>
+            </w:r>
+            <w:proofErr w:type="spellEnd"/>
+            <w:r>
+              <w:rPr>
+                <w:rFonts w:ascii="Arial" w:hAnsi="Arial" w:cs="Arial"/>
+                <w:sz w:val="20"/>
+                <w:szCs w:val="20"/>
+                <w:lang w:val="es-PE"/>
+              </w:rPr>
+              <w:t xml:space="preserve">" es Apache </w:t>
+            </w:r>
+            <w:proofErr w:type="spellStart"/>
+            <w:r>
+              <w:rPr>
+                <w:rFonts w:ascii="Arial" w:hAnsi="Arial" w:cs="Arial"/>
+                <w:sz w:val="20"/>
+                <w:szCs w:val="20"/>
+                <w:lang w:val="es-PE"/>
+              </w:rPr>
+              <w:t>Spark</w:t>
+            </w:r>
+            <w:proofErr w:type="spellEnd"/>
+            <w:r>
+              <w:rPr>
+                <w:rFonts w:ascii="Arial" w:hAnsi="Arial" w:cs="Arial"/>
+                <w:sz w:val="20"/>
+                <w:szCs w:val="20"/>
+                <w:lang w:val="es-PE"/>
+              </w:rPr>
+              <w:t xml:space="preserve">, principalmente por ser el motor computacional nativo de plataformas como </w:t>
+            </w:r>
+            <w:proofErr w:type="spellStart"/>
+            <w:r>
+              <w:rPr>
+                <w:rFonts w:ascii="Arial" w:hAnsi="Arial" w:cs="Arial"/>
+                <w:sz w:val="20"/>
+                <w:szCs w:val="20"/>
+                <w:lang w:val="es-PE"/>
+              </w:rPr>
+              <w:t>Databricks</w:t>
+            </w:r>
+            <w:proofErr w:type="spellEnd"/>
+            <w:r>
+              <w:rPr>
+                <w:rFonts w:ascii="Arial" w:hAnsi="Arial" w:cs="Arial"/>
+                <w:sz w:val="20"/>
+                <w:szCs w:val="20"/>
+                <w:lang w:val="es-PE"/>
+              </w:rPr>
+              <w:t xml:space="preserve"> y el estándar de la industria para el análisis a gran escala. </w:t>
+            </w:r>
+          </w:p>
+          <w:p>
+            <w:pPr>
+              <w:spacing w:before="120"/>
+              <w:ind w:left="284"/>
+              <w:rPr>
+                <w:rFonts w:ascii="Arial" w:hAnsi="Arial" w:cs="Arial"/>
+                <w:sz w:val="20"/>
+                <w:szCs w:val="20"/>
+                <w:lang w:val="es-PE"/>
+              </w:rPr>
+            </w:pPr>
+            <w:r>
+              <w:rPr>
+                <w:rFonts w:ascii="Arial" w:hAnsi="Arial" w:cs="Arial"/>
+                <w:sz w:val="20"/>
+                <w:szCs w:val="20"/>
+                <w:lang w:val="es-PE"/>
+              </w:rPr>
+              <w:t xml:space="preserve">Además, su gran versatilidad permite unificar cargas de trabajo muy diversas en un solo sistema: desde análisis por lotes y </w:t>
+            </w:r>
+            <w:proofErr w:type="spellStart"/>
+            <w:r>
+              <w:rPr>
+                <w:rFonts w:ascii="Arial" w:hAnsi="Arial" w:cs="Arial"/>
+                <w:sz w:val="20"/>
+                <w:szCs w:val="20"/>
+                <w:lang w:val="es-PE"/>
+              </w:rPr>
+              <w:t>streaming</w:t>
+            </w:r>
+            <w:proofErr w:type="spellEnd"/>
+            <w:r>
+              <w:rPr>
+                <w:rFonts w:ascii="Arial" w:hAnsi="Arial" w:cs="Arial"/>
+                <w:sz w:val="20"/>
+                <w:szCs w:val="20"/>
+                <w:lang w:val="es-PE"/>
+              </w:rPr>
+              <w:t xml:space="preserve"> de datos, hasta consultas SQL interactivas y Machine </w:t>
+            </w:r>
+            <w:proofErr w:type="spellStart"/>
+            <w:r>
+              <w:rPr>
+                <w:rFonts w:ascii="Arial" w:hAnsi="Arial" w:cs="Arial"/>
+                <w:sz w:val="20"/>
+                <w:szCs w:val="20"/>
+                <w:lang w:val="es-PE"/>
+              </w:rPr>
+              <w:t>Learning</w:t>
+            </w:r>
+            <w:proofErr w:type="spellEnd"/>
+            <w:r>
+              <w:rPr>
+                <w:rFonts w:ascii="Arial" w:hAnsi="Arial" w:cs="Arial"/>
+                <w:sz w:val="20"/>
+                <w:szCs w:val="20"/>
+                <w:lang w:val="es-PE"/>
+              </w:rPr>
+              <w:t>. Esto lo convierte en la solución integral más potente para cubrir todas las necesidades analíticas del supermercado.</w:t>
+            </w:r>
+          </w:p>
+          <w:p>
+            <w:pPr>
+              <w:spacing w:before="120"/>
+              <w:ind w:left="284"/>
+              <w:rPr>
+                <w:rFonts w:ascii="Arial" w:hAnsi="Arial" w:cs="Arial"/>
+                <w:sz w:val="20"/>
+                <w:szCs w:val="20"/>
+                <w:lang w:val="es-PE"/>
+              </w:rPr>
+            </w:pPr>
           </w:p>
         </w:tc>
       </w:tr>
@@ -2450,6 +2774,68 @@
               </w:rPr>
               <w:t> </w:t>
             </w:r>
+            <w:r>
+              <w:rPr>
+                <w:rFonts w:ascii="Arial" w:hAnsi="Arial" w:cs="Arial"/>
+                <w:sz w:val="20"/>
+                <w:szCs w:val="20"/>
+                <w:lang w:val="es-PE"/>
+              </w:rPr>
+              <w:t xml:space="preserve">Las herramientas de análisis de Big Data se aplican para transformar los datos crudos en decisiones empresariales de alto impacto. Por ejemplo, mediante modelos de Machine </w:t>
+            </w:r>
+            <w:proofErr w:type="spellStart"/>
+            <w:r>
+              <w:rPr>
+                <w:rFonts w:ascii="Arial" w:hAnsi="Arial" w:cs="Arial"/>
+                <w:sz w:val="20"/>
+                <w:szCs w:val="20"/>
+                <w:lang w:val="es-PE"/>
+              </w:rPr>
+              <w:t>Learning</w:t>
+            </w:r>
+            <w:proofErr w:type="spellEnd"/>
+            <w:r>
+              <w:rPr>
+                <w:rFonts w:ascii="Arial" w:hAnsi="Arial" w:cs="Arial"/>
+                <w:sz w:val="20"/>
+                <w:szCs w:val="20"/>
+                <w:lang w:val="es-PE"/>
+              </w:rPr>
+              <w:t xml:space="preserve">, es posible predecir la demanda de productos con gran precisión, lo que permite optimizar la gestión de inventario para reducir mermas y evitar quiebres de stock. </w:t>
+            </w:r>
+          </w:p>
+          <w:p>
+            <w:pPr>
+              <w:spacing w:before="120"/>
+              <w:ind w:left="284"/>
+              <w:rPr>
+                <w:rFonts w:ascii="Arial" w:hAnsi="Arial" w:cs="Arial"/>
+                <w:sz w:val="20"/>
+                <w:szCs w:val="20"/>
+                <w:lang w:val="es-PE"/>
+              </w:rPr>
+            </w:pPr>
+            <w:r>
+              <w:rPr>
+                <w:rFonts w:ascii="Arial" w:hAnsi="Arial" w:cs="Arial"/>
+                <w:sz w:val="20"/>
+                <w:szCs w:val="20"/>
+                <w:lang w:val="es-PE"/>
+              </w:rPr>
+              <w:t xml:space="preserve">En el ámbito del marketing, el análisis del historial de compras permite una microsegmentación de clientes, facilitando el envío de ofertas y promociones altamente personalizadas que incrementan la lealtad. </w:t>
+            </w:r>
+          </w:p>
+          <w:p>
+            <w:pPr>
+              <w:spacing w:before="120"/>
+              <w:ind w:left="284"/>
+              <w:rPr>
+                <w:rFonts w:ascii="Arial" w:hAnsi="Arial" w:cs="Arial"/>
+                <w:sz w:val="20"/>
+                <w:szCs w:val="20"/>
+                <w:lang w:val="es-PE"/>
+              </w:rPr>
+            </w:pPr>
           </w:p>
         </w:tc>
       </w:tr>
@@ -2538,8 +2924,6 @@
               </w:rPr>
               <w:t>el supermercado</w:t>
             </w:r>
-            <w:bookmarkStart w:id="0" w:name="_GoBack"/>
-            <w:bookmarkEnd w:id="0"/>
             <w:r>
               <w:rPr>
                 <w:rFonts w:ascii="Arial" w:hAnsi="Arial" w:cs="Arial"/>
@@ -2598,34 +2982,52 @@
               </w:rPr>
               <w:t> </w:t>
             </w:r>
+            <w:r>
+              <w:rPr>
+                <w:rFonts w:ascii="Arial" w:hAnsi="Arial" w:cs="Arial"/>
+                <w:sz w:val="20"/>
+                <w:szCs w:val="20"/>
+                <w:lang w:val="es-PE"/>
+              </w:rPr>
+              <w:t xml:space="preserve">El principal desafío legal es el cumplimiento riguroso de las leyes de protección de datos, lo que exige obtener el consentimiento explícito de los clientes para la recolección y uso de su información personal. La empresa debe ser completamente transparente sobre los fines del análisis y garantizar los derechos del usuario, como el acceso y la supresión de sus datos. </w:t>
+            </w:r>
+          </w:p>
+          <w:p>
+            <w:pPr>
+              <w:spacing w:before="120"/>
+              <w:ind w:left="284"/>
+              <w:rPr>
+                <w:rFonts w:ascii="Arial" w:hAnsi="Arial" w:cs="Arial"/>
+                <w:sz w:val="20"/>
+                <w:szCs w:val="20"/>
+                <w:lang w:val="es-PE"/>
+              </w:rPr>
+            </w:pPr>
+            <w:r>
+              <w:rPr>
+                <w:rFonts w:ascii="Arial" w:hAnsi="Arial" w:cs="Arial"/>
+                <w:sz w:val="20"/>
+                <w:szCs w:val="20"/>
+                <w:lang w:val="es-PE"/>
+              </w:rPr>
+              <w:t>Desde el punto de vista ético, el reto es utilizar los algoritmos de manera justa, evitando sesgos discriminatorios en la personalización de precios u ofertas que puedan perjudicar a ciertos grupos. Finalmente, existe la responsabilidad fundamental de implementar una ciberseguridad robusta para proteger la privacidad y mantener la confianza del cliente.</w:t>
+            </w:r>
+          </w:p>
+          <w:p>
+            <w:pPr>
+              <w:spacing w:before="120"/>
+              <w:ind w:left="284"/>
+              <w:rPr>
+                <w:rFonts w:ascii="Arial" w:hAnsi="Arial" w:cs="Arial"/>
+                <w:sz w:val="20"/>
+                <w:szCs w:val="20"/>
+                <w:lang w:val="es-PE"/>
+              </w:rPr>
+            </w:pPr>
           </w:p>
         </w:tc>
       </w:tr>
     </w:tbl>
-    <w:p>
-      <w:pPr>
-        <w:pStyle w:val="Prrafodelista"/>
-        <w:ind w:left="360"/>
-        <w:rPr>
-          <w:rFonts w:ascii="Arial" w:hAnsi="Arial" w:cs="Arial"/>
-          <w:sz w:val="20"/>
-          <w:szCs w:val="20"/>
-          <w:lang w:val="es-PE"/>
-        </w:rPr>
-      </w:pPr>
-    </w:p>
-    <w:p>
-      <w:pPr>
-        <w:pStyle w:val="Prrafodelista"/>
-        <w:ind w:left="360"/>
-        <w:rPr>
-          <w:rFonts w:ascii="Arial" w:hAnsi="Arial" w:cs="Arial"/>
-          <w:sz w:val="20"/>
-          <w:szCs w:val="20"/>
-          <w:lang w:val="es-PE"/>
-        </w:rPr>
-      </w:pPr>
-    </w:p>
     <w:p>
       <w:pPr>
         <w:pStyle w:val="Prrafodelista"/>
@@ -3247,7 +3649,23 @@
                 <w:sz w:val="20"/>
                 <w:szCs w:val="20"/>
               </w:rPr>
-              <w:t>18/05</w:t>
+              <w:t>24</w:t>
+            </w:r>
+            <w:r>
+              <w:rPr>
+                <w:rFonts w:ascii="Arial" w:hAnsi="Arial" w:cs="Arial"/>
+                <w:sz w:val="20"/>
+                <w:szCs w:val="20"/>
+              </w:rPr>
+              <w:t>/0</w:t>
+            </w:r>
+            <w:r>
+              <w:rPr>
+                <w:rFonts w:ascii="Arial" w:hAnsi="Arial" w:cs="Arial"/>
+                <w:sz w:val="20"/>
+                <w:szCs w:val="20"/>
+              </w:rPr>
+              <w:t>8</w:t>
             </w:r>
           </w:p>
         </w:tc>
@@ -3271,7 +3689,23 @@
                 <w:sz w:val="20"/>
                 <w:szCs w:val="20"/>
               </w:rPr>
-              <w:t>19/05</w:t>
+              <w:t>29</w:t>
+            </w:r>
+            <w:r>
+              <w:rPr>
+                <w:rFonts w:ascii="Arial" w:hAnsi="Arial" w:cs="Arial"/>
+                <w:sz w:val="20"/>
+                <w:szCs w:val="20"/>
+              </w:rPr>
+              <w:t>/0</w:t>
+            </w:r>
+            <w:r>
+              <w:rPr>
+                <w:rFonts w:ascii="Arial" w:hAnsi="Arial" w:cs="Arial"/>
+                <w:sz w:val="20"/>
+                <w:szCs w:val="20"/>
+              </w:rPr>
+              <w:t>8</w:t>
             </w:r>
           </w:p>
         </w:tc>
@@ -3412,7 +3846,23 @@
                 <w:sz w:val="20"/>
                 <w:szCs w:val="20"/>
               </w:rPr>
-              <w:t>21/05</w:t>
+              <w:t>30</w:t>
+            </w:r>
+            <w:r>
+              <w:rPr>
+                <w:rFonts w:ascii="Arial" w:hAnsi="Arial" w:cs="Arial"/>
+                <w:sz w:val="20"/>
+                <w:szCs w:val="20"/>
+              </w:rPr>
+              <w:t>/0</w:t>
+            </w:r>
+            <w:r>
+              <w:rPr>
+                <w:rFonts w:ascii="Arial" w:hAnsi="Arial" w:cs="Arial"/>
+                <w:sz w:val="20"/>
+                <w:szCs w:val="20"/>
+              </w:rPr>
+              <w:t>8</w:t>
             </w:r>
           </w:p>
         </w:tc>
@@ -3436,7 +3886,23 @@
                 <w:sz w:val="20"/>
                 <w:szCs w:val="20"/>
               </w:rPr>
-              <w:t>22/05</w:t>
+              <w:t>03</w:t>
+            </w:r>
+            <w:r>
+              <w:rPr>
+                <w:rFonts w:ascii="Arial" w:hAnsi="Arial" w:cs="Arial"/>
+                <w:sz w:val="20"/>
+                <w:szCs w:val="20"/>
+              </w:rPr>
+              <w:t>/0</w:t>
+            </w:r>
+            <w:r>
+              <w:rPr>
+                <w:rFonts w:ascii="Arial" w:hAnsi="Arial" w:cs="Arial"/>
+                <w:sz w:val="20"/>
+                <w:szCs w:val="20"/>
+              </w:rPr>
+              <w:t>9</w:t>
             </w:r>
           </w:p>
         </w:tc>
@@ -3577,7 +4043,23 @@
                 <w:sz w:val="20"/>
                 <w:szCs w:val="20"/>
               </w:rPr>
-              <w:t>23/05</w:t>
+              <w:t>07</w:t>
+            </w:r>
+            <w:r>
+              <w:rPr>
+                <w:rFonts w:ascii="Arial" w:hAnsi="Arial" w:cs="Arial"/>
+                <w:sz w:val="20"/>
+                <w:szCs w:val="20"/>
+              </w:rPr>
+              <w:t>/0</w:t>
+            </w:r>
+            <w:r>
+              <w:rPr>
+                <w:rFonts w:ascii="Arial" w:hAnsi="Arial" w:cs="Arial"/>
+                <w:sz w:val="20"/>
+                <w:szCs w:val="20"/>
+              </w:rPr>
+              <w:t>9</w:t>
             </w:r>
           </w:p>
         </w:tc>
@@ -3601,7 +4083,23 @@
                 <w:sz w:val="20"/>
                 <w:szCs w:val="20"/>
               </w:rPr>
-              <w:t>24/05</w:t>
+              <w:t>08</w:t>
+            </w:r>
+            <w:r>
+              <w:rPr>
+                <w:rFonts w:ascii="Arial" w:hAnsi="Arial" w:cs="Arial"/>
+                <w:sz w:val="20"/>
+                <w:szCs w:val="20"/>
+              </w:rPr>
+              <w:t>/0</w:t>
+            </w:r>
+            <w:r>
+              <w:rPr>
+                <w:rFonts w:ascii="Arial" w:hAnsi="Arial" w:cs="Arial"/>
+                <w:sz w:val="20"/>
+                <w:szCs w:val="20"/>
+              </w:rPr>
+              <w:t>9</w:t>
             </w:r>
           </w:p>
         </w:tc>
@@ -3742,7 +4240,23 @@
                 <w:sz w:val="20"/>
                 <w:szCs w:val="20"/>
               </w:rPr>
-              <w:t>25/05</w:t>
+              <w:t>12</w:t>
+            </w:r>
+            <w:r>
+              <w:rPr>
+                <w:rFonts w:ascii="Arial" w:hAnsi="Arial" w:cs="Arial"/>
+                <w:sz w:val="20"/>
+                <w:szCs w:val="20"/>
+              </w:rPr>
+              <w:t>/0</w:t>
+            </w:r>
+            <w:r>
+              <w:rPr>
+                <w:rFonts w:ascii="Arial" w:hAnsi="Arial" w:cs="Arial"/>
+                <w:sz w:val="20"/>
+                <w:szCs w:val="20"/>
+              </w:rPr>
+              <w:t>9</w:t>
             </w:r>
           </w:p>
         </w:tc>
@@ -3766,7 +4280,23 @@
                 <w:sz w:val="20"/>
                 <w:szCs w:val="20"/>
               </w:rPr>
-              <w:t>29/05</w:t>
+              <w:t>16</w:t>
+            </w:r>
+            <w:r>
+              <w:rPr>
+                <w:rFonts w:ascii="Arial" w:hAnsi="Arial" w:cs="Arial"/>
+                <w:sz w:val="20"/>
+                <w:szCs w:val="20"/>
+              </w:rPr>
+              <w:t>/0</w:t>
+            </w:r>
+            <w:r>
+              <w:rPr>
+                <w:rFonts w:ascii="Arial" w:hAnsi="Arial" w:cs="Arial"/>
+                <w:sz w:val="20"/>
+                <w:szCs w:val="20"/>
+              </w:rPr>
+              <w:t>9</w:t>
             </w:r>
           </w:p>
         </w:tc>
@@ -3907,7 +4437,23 @@
                 <w:sz w:val="20"/>
                 <w:szCs w:val="20"/>
               </w:rPr>
-              <w:t>30/05</w:t>
+              <w:t>17</w:t>
+            </w:r>
+            <w:r>
+              <w:rPr>
+                <w:rFonts w:ascii="Arial" w:hAnsi="Arial" w:cs="Arial"/>
+                <w:sz w:val="20"/>
+                <w:szCs w:val="20"/>
+              </w:rPr>
+              <w:t>/0</w:t>
+            </w:r>
+            <w:r>
+              <w:rPr>
+                <w:rFonts w:ascii="Arial" w:hAnsi="Arial" w:cs="Arial"/>
+                <w:sz w:val="20"/>
+                <w:szCs w:val="20"/>
+              </w:rPr>
+              <w:t>9</w:t>
             </w:r>
           </w:p>
         </w:tc>
@@ -3931,7 +4477,33 @@
                 <w:sz w:val="20"/>
                 <w:szCs w:val="20"/>
               </w:rPr>
-              <w:t>01/06</w:t>
+              <w:t>2</w:t>
+            </w:r>
+            <w:bookmarkStart w:id="0" w:name="_GoBack"/>
+            <w:bookmarkEnd w:id="0"/>
+            <w:r>
+              <w:rPr>
+                <w:rFonts w:ascii="Arial" w:hAnsi="Arial" w:cs="Arial"/>
+                <w:sz w:val="20"/>
+                <w:szCs w:val="20"/>
+              </w:rPr>
+              <w:t>2</w:t>
+            </w:r>
+            <w:r>
+              <w:rPr>
+                <w:rFonts w:ascii="Arial" w:hAnsi="Arial" w:cs="Arial"/>
+                <w:sz w:val="20"/>
+                <w:szCs w:val="20"/>
+              </w:rPr>
+              <w:t>/0</w:t>
+            </w:r>
+            <w:r>
+              <w:rPr>
+                <w:rFonts w:ascii="Arial" w:hAnsi="Arial" w:cs="Arial"/>
+                <w:sz w:val="20"/>
+                <w:szCs w:val="20"/>
+              </w:rPr>
+              <w:t>9</w:t>
             </w:r>
           </w:p>
         </w:tc>
@@ -4701,6 +5273,32 @@
                 <w:rFonts w:ascii="Arial" w:hAnsi="Arial" w:cs="Arial"/>
               </w:rPr>
             </w:pPr>
+            <w:r>
+              <w:rPr>
+                <w:rFonts w:ascii="Arial" w:hAnsi="Arial" w:cs="Arial"/>
+              </w:rPr>
+              <w:t>Plataforma de Análisis de Datos (</w:t>
+            </w:r>
+            <w:proofErr w:type="spellStart"/>
+            <w:r>
+              <w:rPr>
+                <w:rFonts w:ascii="Arial" w:hAnsi="Arial" w:cs="Arial"/>
+              </w:rPr>
+              <w:t>Databricks</w:t>
+            </w:r>
+            <w:proofErr w:type="spellEnd"/>
+            <w:r>
+              <w:rPr>
+                <w:rFonts w:ascii="Arial" w:hAnsi="Arial" w:cs="Arial"/>
+              </w:rPr>
+              <w:t>)</w:t>
+            </w:r>
+            <w:r>
+              <w:rPr>
+                <w:rFonts w:ascii="Arial" w:hAnsi="Arial" w:cs="Arial"/>
+              </w:rPr>
+              <w:tab/>
+            </w:r>
           </w:p>
         </w:tc>
         <w:tc>
@@ -4720,6 +5318,12 @@
                 <w:rFonts w:ascii="Arial" w:hAnsi="Arial" w:cs="Arial"/>
               </w:rPr>
             </w:pPr>
+            <w:r>
+              <w:rPr>
+                <w:rFonts w:ascii="Arial" w:hAnsi="Arial" w:cs="Arial"/>
+              </w:rPr>
+              <w:t>1</w:t>
+            </w:r>
           </w:p>
         </w:tc>
       </w:tr>
@@ -4748,6 +5352,36 @@
                 <w:spacing w:val="-3"/>
               </w:rPr>
             </w:pPr>
+            <w:r>
+              <w:rPr>
+                <w:rFonts w:ascii="Arial" w:hAnsi="Arial" w:cs="Arial"/>
+                <w:spacing w:val="-3"/>
+              </w:rPr>
+              <w:t xml:space="preserve">Framework de Procesamiento (Apache </w:t>
+            </w:r>
+            <w:proofErr w:type="spellStart"/>
+            <w:r>
+              <w:rPr>
+                <w:rFonts w:ascii="Arial" w:hAnsi="Arial" w:cs="Arial"/>
+                <w:spacing w:val="-3"/>
+              </w:rPr>
+              <w:t>Spark</w:t>
+            </w:r>
+            <w:proofErr w:type="spellEnd"/>
+            <w:r>
+              <w:rPr>
+                <w:rFonts w:ascii="Arial" w:hAnsi="Arial" w:cs="Arial"/>
+                <w:spacing w:val="-3"/>
+              </w:rPr>
+              <w:t>)</w:t>
+            </w:r>
+            <w:r>
+              <w:rPr>
+                <w:rFonts w:ascii="Arial" w:hAnsi="Arial" w:cs="Arial"/>
+                <w:spacing w:val="-3"/>
+              </w:rPr>
+              <w:tab/>
+            </w:r>
           </w:p>
         </w:tc>
         <w:tc>
@@ -4768,6 +5402,13 @@
                 <w:szCs w:val="20"/>
               </w:rPr>
             </w:pPr>
+            <w:r>
+              <w:rPr>
+                <w:rFonts w:ascii="Arial" w:hAnsi="Arial" w:cs="Arial"/>
+                <w:szCs w:val="20"/>
+              </w:rPr>
+              <w:t>Múltiple</w:t>
+            </w:r>
           </w:p>
         </w:tc>
       </w:tr>
@@ -4795,6 +5436,12 @@
                 <w:rFonts w:ascii="Arial" w:hAnsi="Arial" w:cs="Arial"/>
               </w:rPr>
             </w:pPr>
+            <w:r>
+              <w:rPr>
+                <w:rFonts w:ascii="Arial" w:hAnsi="Arial" w:cs="Arial"/>
+              </w:rPr>
+              <w:t>Lenguajes de Programación (Python y SQL)</w:t>
+            </w:r>
           </w:p>
         </w:tc>
         <w:tc>
@@ -4815,6 +5462,13 @@
                 <w:szCs w:val="20"/>
               </w:rPr>
             </w:pPr>
+            <w:r>
+              <w:rPr>
+                <w:rFonts w:ascii="Arial" w:hAnsi="Arial" w:cs="Arial"/>
+                <w:szCs w:val="20"/>
+              </w:rPr>
+              <w:t>Múltiple</w:t>
+            </w:r>
           </w:p>
         </w:tc>
       </w:tr>
@@ -4842,6 +5496,18 @@
                 <w:rFonts w:ascii="Arial" w:hAnsi="Arial" w:cs="Arial"/>
               </w:rPr>
             </w:pPr>
+            <w:r>
+              <w:rPr>
+                <w:rFonts w:ascii="Arial" w:hAnsi="Arial" w:cs="Arial"/>
+              </w:rPr>
+              <w:t>Proveedor de Nube (AWS, Azure o Google Cloud)</w:t>
+            </w:r>
+            <w:r>
+              <w:rPr>
+                <w:rFonts w:ascii="Arial" w:hAnsi="Arial" w:cs="Arial"/>
+              </w:rPr>
+              <w:tab/>
+            </w:r>
           </w:p>
         </w:tc>
         <w:tc>
@@ -4862,6 +5528,13 @@
                 <w:szCs w:val="20"/>
               </w:rPr>
             </w:pPr>
+            <w:r>
+              <w:rPr>
+                <w:rFonts w:ascii="Arial" w:hAnsi="Arial" w:cs="Arial"/>
+                <w:szCs w:val="20"/>
+              </w:rPr>
+              <w:t>1</w:t>
+            </w:r>
           </w:p>
         </w:tc>
       </w:tr>
@@ -4889,6 +5562,46 @@
                 <w:rFonts w:ascii="Arial" w:hAnsi="Arial" w:cs="Arial"/>
               </w:rPr>
             </w:pPr>
+            <w:r>
+              <w:rPr>
+                <w:rFonts w:ascii="Arial" w:hAnsi="Arial" w:cs="Arial"/>
+              </w:rPr>
+              <w:t>Herramienta de BI (</w:t>
+            </w:r>
+            <w:proofErr w:type="spellStart"/>
+            <w:r>
+              <w:rPr>
+                <w:rFonts w:ascii="Arial" w:hAnsi="Arial" w:cs="Arial"/>
+              </w:rPr>
+              <w:t>Power</w:t>
+            </w:r>
+            <w:proofErr w:type="spellEnd"/>
+            <w:r>
+              <w:rPr>
+                <w:rFonts w:ascii="Arial" w:hAnsi="Arial" w:cs="Arial"/>
+              </w:rPr>
+              <w:t xml:space="preserve"> BI, </w:t>
+            </w:r>
+            <w:proofErr w:type="spellStart"/>
+            <w:r>
+              <w:rPr>
+                <w:rFonts w:ascii="Arial" w:hAnsi="Arial" w:cs="Arial"/>
+              </w:rPr>
+              <w:t>Tableau</w:t>
+            </w:r>
+            <w:proofErr w:type="spellEnd"/>
+            <w:r>
+              <w:rPr>
+                <w:rFonts w:ascii="Arial" w:hAnsi="Arial" w:cs="Arial"/>
+              </w:rPr>
+              <w:t>)</w:t>
+            </w:r>
+            <w:r>
+              <w:rPr>
+                <w:rFonts w:ascii="Arial" w:hAnsi="Arial" w:cs="Arial"/>
+              </w:rPr>
+              <w:tab/>
+            </w:r>
           </w:p>
         </w:tc>
         <w:tc>
@@ -4909,6 +5622,13 @@
                 <w:szCs w:val="20"/>
               </w:rPr>
             </w:pPr>
+            <w:r>
+              <w:rPr>
+                <w:rFonts w:ascii="Arial" w:hAnsi="Arial" w:cs="Arial"/>
+                <w:szCs w:val="20"/>
+              </w:rPr>
+              <w:t>1</w:t>
+            </w:r>
           </w:p>
         </w:tc>
       </w:tr>
@@ -4936,6 +5656,46 @@
                 <w:rFonts w:ascii="Arial" w:hAnsi="Arial" w:cs="Arial"/>
               </w:rPr>
             </w:pPr>
+            <w:r>
+              <w:rPr>
+                <w:rFonts w:ascii="Arial" w:hAnsi="Arial" w:cs="Arial"/>
+              </w:rPr>
+              <w:t>Documentación oficial (</w:t>
+            </w:r>
+            <w:proofErr w:type="spellStart"/>
+            <w:r>
+              <w:rPr>
+                <w:rFonts w:ascii="Arial" w:hAnsi="Arial" w:cs="Arial"/>
+              </w:rPr>
+              <w:t>Databricks</w:t>
+            </w:r>
+            <w:proofErr w:type="spellEnd"/>
+            <w:r>
+              <w:rPr>
+                <w:rFonts w:ascii="Arial" w:hAnsi="Arial" w:cs="Arial"/>
+              </w:rPr>
+              <w:t xml:space="preserve">, </w:t>
+            </w:r>
+            <w:proofErr w:type="spellStart"/>
+            <w:r>
+              <w:rPr>
+                <w:rFonts w:ascii="Arial" w:hAnsi="Arial" w:cs="Arial"/>
+              </w:rPr>
+              <w:t>Spark</w:t>
+            </w:r>
+            <w:proofErr w:type="spellEnd"/>
+            <w:r>
+              <w:rPr>
+                <w:rFonts w:ascii="Arial" w:hAnsi="Arial" w:cs="Arial"/>
+              </w:rPr>
+              <w:t>)</w:t>
+            </w:r>
+            <w:r>
+              <w:rPr>
+                <w:rFonts w:ascii="Arial" w:hAnsi="Arial" w:cs="Arial"/>
+              </w:rPr>
+              <w:tab/>
+            </w:r>
           </w:p>
         </w:tc>
         <w:tc>
@@ -4956,6 +5716,13 @@
                 <w:szCs w:val="20"/>
               </w:rPr>
             </w:pPr>
+            <w:r>
+              <w:rPr>
+                <w:rFonts w:ascii="Arial" w:hAnsi="Arial" w:cs="Arial"/>
+                <w:szCs w:val="20"/>
+              </w:rPr>
+              <w:t>Múltiple</w:t>
+            </w:r>
           </w:p>
         </w:tc>
       </w:tr>
@@ -4983,6 +5750,18 @@
                 <w:rFonts w:ascii="Arial" w:hAnsi="Arial" w:cs="Arial"/>
               </w:rPr>
             </w:pPr>
+            <w:r>
+              <w:rPr>
+                <w:rFonts w:ascii="Arial" w:hAnsi="Arial" w:cs="Arial"/>
+              </w:rPr>
+              <w:t>Tutoriales y foros especializados en Big Data</w:t>
+            </w:r>
+            <w:r>
+              <w:rPr>
+                <w:rFonts w:ascii="Arial" w:hAnsi="Arial" w:cs="Arial"/>
+              </w:rPr>
+              <w:tab/>
+            </w:r>
           </w:p>
         </w:tc>
         <w:tc>
@@ -5003,6 +5782,13 @@
                 <w:szCs w:val="20"/>
               </w:rPr>
             </w:pPr>
+            <w:r>
+              <w:rPr>
+                <w:rFonts w:ascii="Arial" w:hAnsi="Arial" w:cs="Arial"/>
+                <w:szCs w:val="20"/>
+              </w:rPr>
+              <w:t>Múltiple</w:t>
+            </w:r>
           </w:p>
         </w:tc>
       </w:tr>
@@ -5752,6 +6538,55 @@
                 <w:szCs w:val="20"/>
               </w:rPr>
             </w:pPr>
+            <w:r>
+              <w:rPr>
+                <w:rFonts w:ascii="Arial" w:hAnsi="Arial" w:cs="Arial"/>
+                <w:b/>
+                <w:sz w:val="20"/>
+                <w:szCs w:val="20"/>
+              </w:rPr>
+              <w:t>Como parte de las estrategias para fortalecer la inteligencia de negocio y obtener una ventaja competitiva desde su lanzamiento, se propone para "</w:t>
+            </w:r>
+            <w:proofErr w:type="spellStart"/>
+            <w:r>
+              <w:rPr>
+                <w:rFonts w:ascii="Arial" w:hAnsi="Arial" w:cs="Arial"/>
+                <w:b/>
+                <w:sz w:val="20"/>
+                <w:szCs w:val="20"/>
+              </w:rPr>
+              <w:t>MercadoFresh</w:t>
+            </w:r>
+            <w:proofErr w:type="spellEnd"/>
+            <w:r>
+              <w:rPr>
+                <w:rFonts w:ascii="Arial" w:hAnsi="Arial" w:cs="Arial"/>
+                <w:b/>
+                <w:sz w:val="20"/>
+                <w:szCs w:val="20"/>
+              </w:rPr>
+              <w:t xml:space="preserve">" la implementación de una plataforma de Big Data unificada, desarrollada sobre </w:t>
+            </w:r>
+            <w:proofErr w:type="spellStart"/>
+            <w:r>
+              <w:rPr>
+                <w:rFonts w:ascii="Arial" w:hAnsi="Arial" w:cs="Arial"/>
+                <w:b/>
+                <w:sz w:val="20"/>
+                <w:szCs w:val="20"/>
+              </w:rPr>
+              <w:t>Databricks</w:t>
+            </w:r>
+            <w:proofErr w:type="spellEnd"/>
+            <w:r>
+              <w:rPr>
+                <w:rFonts w:ascii="Arial" w:hAnsi="Arial" w:cs="Arial"/>
+                <w:b/>
+                <w:sz w:val="20"/>
+                <w:szCs w:val="20"/>
+              </w:rPr>
+              <w:t xml:space="preserve">. </w:t>
+            </w:r>
           </w:p>
           <w:p>
             <w:pPr>
@@ -5763,6 +6598,35 @@
                 <w:szCs w:val="20"/>
               </w:rPr>
             </w:pPr>
+            <w:r>
+              <w:rPr>
+                <w:rFonts w:ascii="Arial" w:hAnsi="Arial" w:cs="Arial"/>
+                <w:b/>
+                <w:sz w:val="20"/>
+                <w:szCs w:val="20"/>
+              </w:rPr>
+              <w:t xml:space="preserve">Esta solución busca construir una arquitectura </w:t>
+            </w:r>
+            <w:proofErr w:type="spellStart"/>
+            <w:r>
+              <w:rPr>
+                <w:rFonts w:ascii="Arial" w:hAnsi="Arial" w:cs="Arial"/>
+                <w:b/>
+                <w:sz w:val="20"/>
+                <w:szCs w:val="20"/>
+              </w:rPr>
+              <w:t>Lakehouse</w:t>
+            </w:r>
+            <w:proofErr w:type="spellEnd"/>
+            <w:r>
+              <w:rPr>
+                <w:rFonts w:ascii="Arial" w:hAnsi="Arial" w:cs="Arial"/>
+                <w:b/>
+                <w:sz w:val="20"/>
+                <w:szCs w:val="20"/>
+              </w:rPr>
+              <w:t xml:space="preserve"> para digitalizar y centralizar el análisis de todas las fuentes de datos, incluyendo ventas, inventario, interacciones con clientes y operaciones. El objetivo es reemplazar la toma de decisiones basada en la intuición por una cultura empresarial fundamentada en datos, la cual resulta más ágil, precisa y rentable, mitigando los riesgos de una gestión ineficiente.</w:t>
+            </w:r>
           </w:p>
           <w:p>
             <w:pPr>
@@ -5774,6 +6638,95 @@
                 <w:szCs w:val="20"/>
               </w:rPr>
             </w:pPr>
+            <w:r>
+              <w:rPr>
+                <w:rFonts w:ascii="Arial" w:hAnsi="Arial" w:cs="Arial"/>
+                <w:b/>
+                <w:sz w:val="20"/>
+                <w:szCs w:val="20"/>
+              </w:rPr>
+              <w:t xml:space="preserve">Esta plataforma utilizará el poder de Apache </w:t>
+            </w:r>
+            <w:proofErr w:type="spellStart"/>
+            <w:r>
+              <w:rPr>
+                <w:rFonts w:ascii="Arial" w:hAnsi="Arial" w:cs="Arial"/>
+                <w:b/>
+                <w:sz w:val="20"/>
+                <w:szCs w:val="20"/>
+              </w:rPr>
+              <w:t>Spark</w:t>
+            </w:r>
+            <w:proofErr w:type="spellEnd"/>
+            <w:r>
+              <w:rPr>
+                <w:rFonts w:ascii="Arial" w:hAnsi="Arial" w:cs="Arial"/>
+                <w:b/>
+                <w:sz w:val="20"/>
+                <w:szCs w:val="20"/>
+              </w:rPr>
+              <w:t xml:space="preserve"> para el procesamiento de datos y Delta Lake para el almacenamiento confiable y escalable en la nube (AWS, Azure o GCP). A través de notebooks de </w:t>
+            </w:r>
+            <w:proofErr w:type="spellStart"/>
+            <w:r>
+              <w:rPr>
+                <w:rFonts w:ascii="Arial" w:hAnsi="Arial" w:cs="Arial"/>
+                <w:b/>
+                <w:sz w:val="20"/>
+                <w:szCs w:val="20"/>
+              </w:rPr>
+              <w:t>Databricks</w:t>
+            </w:r>
+            <w:proofErr w:type="spellEnd"/>
+            <w:r>
+              <w:rPr>
+                <w:rFonts w:ascii="Arial" w:hAnsi="Arial" w:cs="Arial"/>
+                <w:b/>
+                <w:sz w:val="20"/>
+                <w:szCs w:val="20"/>
+              </w:rPr>
+              <w:t>, los equipos de datos podrán desarrollar pipelines para procesar información tanto en tiempo real (</w:t>
+            </w:r>
+            <w:proofErr w:type="spellStart"/>
+            <w:r>
+              <w:rPr>
+                <w:rFonts w:ascii="Arial" w:hAnsi="Arial" w:cs="Arial"/>
+                <w:b/>
+                <w:sz w:val="20"/>
+                <w:szCs w:val="20"/>
+              </w:rPr>
+              <w:t>streaming</w:t>
+            </w:r>
+            <w:proofErr w:type="spellEnd"/>
+            <w:r>
+              <w:rPr>
+                <w:rFonts w:ascii="Arial" w:hAnsi="Arial" w:cs="Arial"/>
+                <w:b/>
+                <w:sz w:val="20"/>
+                <w:szCs w:val="20"/>
+              </w:rPr>
+              <w:t>) como por lotes (</w:t>
+            </w:r>
+            <w:proofErr w:type="spellStart"/>
+            <w:r>
+              <w:rPr>
+                <w:rFonts w:ascii="Arial" w:hAnsi="Arial" w:cs="Arial"/>
+                <w:b/>
+                <w:sz w:val="20"/>
+                <w:szCs w:val="20"/>
+              </w:rPr>
+              <w:t>batch</w:t>
+            </w:r>
+            <w:proofErr w:type="spellEnd"/>
+            <w:r>
+              <w:rPr>
+                <w:rFonts w:ascii="Arial" w:hAnsi="Arial" w:cs="Arial"/>
+                <w:b/>
+                <w:sz w:val="20"/>
+                <w:szCs w:val="20"/>
+              </w:rPr>
+              <w:t xml:space="preserve">). </w:t>
+            </w:r>
           </w:p>
           <w:p>
             <w:pPr>
@@ -5785,6 +6738,75 @@
                 <w:szCs w:val="20"/>
               </w:rPr>
             </w:pPr>
+            <w:r>
+              <w:rPr>
+                <w:rFonts w:ascii="Arial" w:hAnsi="Arial" w:cs="Arial"/>
+                <w:b/>
+                <w:sz w:val="20"/>
+                <w:szCs w:val="20"/>
+              </w:rPr>
+              <w:t xml:space="preserve">Se crearán tablas optimizadas y se conectarán a herramientas de Business </w:t>
+            </w:r>
+            <w:proofErr w:type="spellStart"/>
+            <w:r>
+              <w:rPr>
+                <w:rFonts w:ascii="Arial" w:hAnsi="Arial" w:cs="Arial"/>
+                <w:b/>
+                <w:sz w:val="20"/>
+                <w:szCs w:val="20"/>
+              </w:rPr>
+              <w:t>Intelligence</w:t>
+            </w:r>
+            <w:proofErr w:type="spellEnd"/>
+            <w:r>
+              <w:rPr>
+                <w:rFonts w:ascii="Arial" w:hAnsi="Arial" w:cs="Arial"/>
+                <w:b/>
+                <w:sz w:val="20"/>
+                <w:szCs w:val="20"/>
+              </w:rPr>
+              <w:t xml:space="preserve"> como </w:t>
+            </w:r>
+            <w:proofErr w:type="spellStart"/>
+            <w:r>
+              <w:rPr>
+                <w:rFonts w:ascii="Arial" w:hAnsi="Arial" w:cs="Arial"/>
+                <w:b/>
+                <w:sz w:val="20"/>
+                <w:szCs w:val="20"/>
+              </w:rPr>
+              <w:t>Power</w:t>
+            </w:r>
+            <w:proofErr w:type="spellEnd"/>
+            <w:r>
+              <w:rPr>
+                <w:rFonts w:ascii="Arial" w:hAnsi="Arial" w:cs="Arial"/>
+                <w:b/>
+                <w:sz w:val="20"/>
+                <w:szCs w:val="20"/>
+              </w:rPr>
+              <w:t xml:space="preserve"> BI para generar </w:t>
+            </w:r>
+            <w:proofErr w:type="spellStart"/>
+            <w:r>
+              <w:rPr>
+                <w:rFonts w:ascii="Arial" w:hAnsi="Arial" w:cs="Arial"/>
+                <w:b/>
+                <w:sz w:val="20"/>
+                <w:szCs w:val="20"/>
+              </w:rPr>
+              <w:t>dashboards</w:t>
+            </w:r>
+            <w:proofErr w:type="spellEnd"/>
+            <w:r>
+              <w:rPr>
+                <w:rFonts w:ascii="Arial" w:hAnsi="Arial" w:cs="Arial"/>
+                <w:b/>
+                <w:sz w:val="20"/>
+                <w:szCs w:val="20"/>
+              </w:rPr>
+              <w:t xml:space="preserve"> interactivos. Este sistema permitirá analizar desde patrones de compra hasta la optimización de la cadena de suministro, adaptándose perfectamente al flujo operativo de un supermercado moderno.</w:t>
+            </w:r>
           </w:p>
           <w:p>
             <w:pPr>
@@ -5796,6 +6818,73 @@
                 <w:szCs w:val="20"/>
               </w:rPr>
             </w:pPr>
+            <w:r>
+              <w:rPr>
+                <w:noProof/>
+              </w:rPr>
+              <w:drawing>
+                <wp:anchor distT="0" distB="0" distL="114300" distR="114300" simplePos="0" relativeHeight="251712512" behindDoc="0" locked="0" layoutInCell="1" allowOverlap="1" wp14:anchorId="1655B49E" wp14:editId="328F0E5B">
+                  <wp:simplePos x="0" y="0"/>
+                  <wp:positionH relativeFrom="margin">
+                    <wp:posOffset>648335</wp:posOffset>
+                  </wp:positionH>
+                  <wp:positionV relativeFrom="margin">
+                    <wp:posOffset>3286125</wp:posOffset>
+                  </wp:positionV>
+                  <wp:extent cx="4204970" cy="4228465"/>
+                  <wp:effectExtent l="0" t="0" r="5080" b="635"/>
+                  <wp:wrapSquare wrapText="bothSides"/>
+                  <wp:docPr id="3" name="Imagen 3"/>
+                  <wp:cNvGraphicFramePr>
+                    <a:graphicFrameLocks xmlns:a="http://schemas.openxmlformats.org/drawingml/2006/main" noChangeAspect="1"/>
+                  </wp:cNvGraphicFramePr>
+                  <a:graphic xmlns:a="http://schemas.openxmlformats.org/drawingml/2006/main">
+                    <a:graphicData uri="http://schemas.openxmlformats.org/drawingml/2006/picture">
+                      <pic:pic xmlns:pic="http://schemas.openxmlformats.org/drawingml/2006/picture">
+                        <pic:nvPicPr>
+                          <pic:cNvPr id="0" name="Picture 7"/>
+                          <pic:cNvPicPr>
+                            <a:picLocks noChangeAspect="1" noChangeArrowheads="1"/>
+                          </pic:cNvPicPr>
+                        </pic:nvPicPr>
+                        <pic:blipFill>
+                          <a:blip r:embed="rId15">
+                            <a:extLst>
+                              <a:ext uri="{28A0092B-C50C-407E-A947-70E740481C1C}">
+                                <a14:useLocalDpi xmlns:a14="http://schemas.microsoft.com/office/drawing/2010/main" val="0"/>
+                              </a:ext>
+                            </a:extLst>
+                          </a:blip>
+                          <a:srcRect/>
+                          <a:stretch>
+                            <a:fillRect/>
+                          </a:stretch>
+                        </pic:blipFill>
+                        <pic:spPr bwMode="auto">
+                          <a:xfrm>
+                            <a:off x="0" y="0"/>
+                            <a:ext cx="4204970" cy="4228465"/>
+                          </a:xfrm>
+                          <a:prstGeom prst="rect">
+                            <a:avLst/>
+                          </a:prstGeom>
+                          <a:noFill/>
+                          <a:ln>
+                            <a:noFill/>
+                          </a:ln>
+                        </pic:spPr>
+                      </pic:pic>
+                    </a:graphicData>
+                  </a:graphic>
+                  <wp14:sizeRelH relativeFrom="margin">
+                    <wp14:pctWidth>0</wp14:pctWidth>
+                  </wp14:sizeRelH>
+                  <wp14:sizeRelV relativeFrom="margin">
+                    <wp14:pctHeight>0</wp14:pctHeight>
+                  </wp14:sizeRelV>
+                </wp:anchor>
+              </w:drawing>
+            </w:r>
           </w:p>
           <w:p>
             <w:pPr>
@@ -6000,18 +7089,96 @@
               <w:spacing w:before="120" w:line="276" w:lineRule="auto"/>
               <w:rPr>
                 <w:rFonts w:ascii="Arial" w:hAnsi="Arial" w:cs="Arial"/>
-                <w:b/>
-                <w:sz w:val="20"/>
-                <w:szCs w:val="20"/>
-              </w:rPr>
-            </w:pPr>
+                <w:sz w:val="20"/>
+                <w:szCs w:val="20"/>
+              </w:rPr>
+            </w:pPr>
+            <w:r>
+              <w:rPr>
+                <w:rFonts w:ascii="Arial" w:hAnsi="Arial" w:cs="Arial"/>
+                <w:sz w:val="20"/>
+                <w:szCs w:val="20"/>
+              </w:rPr>
+              <w:t xml:space="preserve">Primero, comencé configurando la infraestructura base en un proveedor de nube y desplegando el </w:t>
+            </w:r>
+            <w:proofErr w:type="spellStart"/>
+            <w:r>
+              <w:rPr>
+                <w:rFonts w:ascii="Arial" w:hAnsi="Arial" w:cs="Arial"/>
+                <w:sz w:val="20"/>
+                <w:szCs w:val="20"/>
+              </w:rPr>
+              <w:t>workspace</w:t>
+            </w:r>
+            <w:proofErr w:type="spellEnd"/>
+            <w:r>
+              <w:rPr>
+                <w:rFonts w:ascii="Arial" w:hAnsi="Arial" w:cs="Arial"/>
+                <w:sz w:val="20"/>
+                <w:szCs w:val="20"/>
+              </w:rPr>
+              <w:t xml:space="preserve"> de </w:t>
+            </w:r>
+            <w:proofErr w:type="spellStart"/>
+            <w:r>
+              <w:rPr>
+                <w:rFonts w:ascii="Arial" w:hAnsi="Arial" w:cs="Arial"/>
+                <w:sz w:val="20"/>
+                <w:szCs w:val="20"/>
+              </w:rPr>
+              <w:t>Databricks</w:t>
+            </w:r>
+            <w:proofErr w:type="spellEnd"/>
+            <w:r>
+              <w:rPr>
+                <w:rFonts w:ascii="Arial" w:hAnsi="Arial" w:cs="Arial"/>
+                <w:sz w:val="20"/>
+                <w:szCs w:val="20"/>
+              </w:rPr>
+              <w:t xml:space="preserve">, lo que me permitió tener un entorno de análisis colaborativo y escalable. Inicialicé la estructura del proyecto definiendo las capas de la arquitectura </w:t>
+            </w:r>
+            <w:proofErr w:type="spellStart"/>
+            <w:r>
+              <w:rPr>
+                <w:rFonts w:ascii="Arial" w:hAnsi="Arial" w:cs="Arial"/>
+                <w:sz w:val="20"/>
+                <w:szCs w:val="20"/>
+              </w:rPr>
+              <w:t>Lakehouse</w:t>
+            </w:r>
+            <w:proofErr w:type="spellEnd"/>
+            <w:r>
+              <w:rPr>
+                <w:rFonts w:ascii="Arial" w:hAnsi="Arial" w:cs="Arial"/>
+                <w:sz w:val="20"/>
+                <w:szCs w:val="20"/>
+              </w:rPr>
+              <w:t xml:space="preserve">: </w:t>
+            </w:r>
+            <w:proofErr w:type="spellStart"/>
+            <w:r>
+              <w:rPr>
+                <w:rFonts w:ascii="Arial" w:hAnsi="Arial" w:cs="Arial"/>
+                <w:sz w:val="20"/>
+                <w:szCs w:val="20"/>
+              </w:rPr>
+              <w:t>Bronze</w:t>
+            </w:r>
+            <w:proofErr w:type="spellEnd"/>
+            <w:r>
+              <w:rPr>
+                <w:rFonts w:ascii="Arial" w:hAnsi="Arial" w:cs="Arial"/>
+                <w:sz w:val="20"/>
+                <w:szCs w:val="20"/>
+              </w:rPr>
+              <w:t xml:space="preserve"> (datos brutos), Silver (datos limpios y enriquecidos) y Gold (datos agregados para negocio).</w:t>
+            </w:r>
           </w:p>
           <w:p>
             <w:pPr>
               <w:spacing w:before="120" w:line="276" w:lineRule="auto"/>
               <w:rPr>
                 <w:rFonts w:ascii="Arial" w:hAnsi="Arial" w:cs="Arial"/>
-                <w:b/>
                 <w:sz w:val="20"/>
                 <w:szCs w:val="20"/>
               </w:rPr>
@@ -6022,11 +7189,554 @@
               <w:spacing w:before="120" w:line="276" w:lineRule="auto"/>
               <w:rPr>
                 <w:rFonts w:ascii="Arial" w:hAnsi="Arial" w:cs="Arial"/>
-                <w:b/>
-                <w:sz w:val="20"/>
-                <w:szCs w:val="20"/>
-              </w:rPr>
-            </w:pPr>
+                <w:sz w:val="20"/>
+                <w:szCs w:val="20"/>
+              </w:rPr>
+            </w:pPr>
+            <w:r>
+              <w:rPr>
+                <w:rFonts w:ascii="Arial" w:hAnsi="Arial" w:cs="Arial"/>
+                <w:sz w:val="20"/>
+                <w:szCs w:val="20"/>
+              </w:rPr>
+              <w:t xml:space="preserve">Luego, diseñé y desarrollé los pipelines de ingesta de datos utilizando notebooks de Python y </w:t>
+            </w:r>
+            <w:proofErr w:type="spellStart"/>
+            <w:r>
+              <w:rPr>
+                <w:rFonts w:ascii="Arial" w:hAnsi="Arial" w:cs="Arial"/>
+                <w:sz w:val="20"/>
+                <w:szCs w:val="20"/>
+              </w:rPr>
+              <w:t>Spark</w:t>
+            </w:r>
+            <w:proofErr w:type="spellEnd"/>
+            <w:r>
+              <w:rPr>
+                <w:rFonts w:ascii="Arial" w:hAnsi="Arial" w:cs="Arial"/>
+                <w:sz w:val="20"/>
+                <w:szCs w:val="20"/>
+              </w:rPr>
+              <w:t xml:space="preserve"> SQL. Definí los procesos para capturar datos de fuentes clave: transacciones de los puntos de venta (POS), datos de navegación del e-</w:t>
+            </w:r>
+            <w:proofErr w:type="spellStart"/>
+            <w:r>
+              <w:rPr>
+                <w:rFonts w:ascii="Arial" w:hAnsi="Arial" w:cs="Arial"/>
+                <w:sz w:val="20"/>
+                <w:szCs w:val="20"/>
+              </w:rPr>
+              <w:t>commerce</w:t>
+            </w:r>
+            <w:proofErr w:type="spellEnd"/>
+            <w:r>
+              <w:rPr>
+                <w:rFonts w:ascii="Arial" w:hAnsi="Arial" w:cs="Arial"/>
+                <w:sz w:val="20"/>
+                <w:szCs w:val="20"/>
+              </w:rPr>
+              <w:t xml:space="preserve"> y registros de inventario de sensores </w:t>
+            </w:r>
+            <w:proofErr w:type="spellStart"/>
+            <w:r>
+              <w:rPr>
+                <w:rFonts w:ascii="Arial" w:hAnsi="Arial" w:cs="Arial"/>
+                <w:sz w:val="20"/>
+                <w:szCs w:val="20"/>
+              </w:rPr>
+              <w:t>IoT</w:t>
+            </w:r>
+            <w:proofErr w:type="spellEnd"/>
+            <w:r>
+              <w:rPr>
+                <w:rFonts w:ascii="Arial" w:hAnsi="Arial" w:cs="Arial"/>
+                <w:sz w:val="20"/>
+                <w:szCs w:val="20"/>
+              </w:rPr>
+              <w:t xml:space="preserve">. Estos flujos de datos se encargan de cargar la información cruda en la capa </w:t>
+            </w:r>
+            <w:proofErr w:type="spellStart"/>
+            <w:r>
+              <w:rPr>
+                <w:rFonts w:ascii="Arial" w:hAnsi="Arial" w:cs="Arial"/>
+                <w:sz w:val="20"/>
+                <w:szCs w:val="20"/>
+              </w:rPr>
+              <w:t>Bronze</w:t>
+            </w:r>
+            <w:proofErr w:type="spellEnd"/>
+            <w:r>
+              <w:rPr>
+                <w:rFonts w:ascii="Arial" w:hAnsi="Arial" w:cs="Arial"/>
+                <w:sz w:val="20"/>
+                <w:szCs w:val="20"/>
+              </w:rPr>
+              <w:t xml:space="preserve"> de nuestro Delta Lake.</w:t>
+            </w:r>
+          </w:p>
+          <w:p>
+            <w:pPr>
+              <w:spacing w:before="120" w:line="276" w:lineRule="auto"/>
+              <w:rPr>
+                <w:rFonts w:ascii="Arial" w:hAnsi="Arial" w:cs="Arial"/>
+                <w:sz w:val="20"/>
+                <w:szCs w:val="20"/>
+              </w:rPr>
+            </w:pPr>
+          </w:p>
+          <w:p>
+            <w:pPr>
+              <w:spacing w:before="120" w:line="276" w:lineRule="auto"/>
+              <w:rPr>
+                <w:rFonts w:ascii="Arial" w:hAnsi="Arial" w:cs="Arial"/>
+                <w:sz w:val="20"/>
+                <w:szCs w:val="20"/>
+              </w:rPr>
+            </w:pPr>
+            <w:r>
+              <w:rPr>
+                <w:rFonts w:ascii="Arial" w:hAnsi="Arial" w:cs="Arial"/>
+                <w:sz w:val="20"/>
+                <w:szCs w:val="20"/>
+              </w:rPr>
+              <w:t xml:space="preserve">Después, implementé las lógicas de transformación y limpieza para pasar los datos de la capa </w:t>
+            </w:r>
+            <w:proofErr w:type="spellStart"/>
+            <w:r>
+              <w:rPr>
+                <w:rFonts w:ascii="Arial" w:hAnsi="Arial" w:cs="Arial"/>
+                <w:sz w:val="20"/>
+                <w:szCs w:val="20"/>
+              </w:rPr>
+              <w:t>Bronze</w:t>
+            </w:r>
+            <w:proofErr w:type="spellEnd"/>
+            <w:r>
+              <w:rPr>
+                <w:rFonts w:ascii="Arial" w:hAnsi="Arial" w:cs="Arial"/>
+                <w:sz w:val="20"/>
+                <w:szCs w:val="20"/>
+              </w:rPr>
+              <w:t xml:space="preserve"> a la capa Silver. Utilicé Apache </w:t>
+            </w:r>
+            <w:proofErr w:type="spellStart"/>
+            <w:r>
+              <w:rPr>
+                <w:rFonts w:ascii="Arial" w:hAnsi="Arial" w:cs="Arial"/>
+                <w:sz w:val="20"/>
+                <w:szCs w:val="20"/>
+              </w:rPr>
+              <w:t>Spark</w:t>
+            </w:r>
+            <w:proofErr w:type="spellEnd"/>
+            <w:r>
+              <w:rPr>
+                <w:rFonts w:ascii="Arial" w:hAnsi="Arial" w:cs="Arial"/>
+                <w:sz w:val="20"/>
+                <w:szCs w:val="20"/>
+              </w:rPr>
+              <w:t xml:space="preserve"> para unificar y enriquecer la información, por ejemplo, cruzando los datos de ventas con los perfiles de clientes del programa de lealtad. Esto aseguró que los datos fueran consistentes, confiables y estuvieran listos para un análisis más complejo.</w:t>
+            </w:r>
+          </w:p>
+          <w:p>
+            <w:pPr>
+              <w:spacing w:before="120" w:line="276" w:lineRule="auto"/>
+              <w:rPr>
+                <w:rFonts w:ascii="Arial" w:hAnsi="Arial" w:cs="Arial"/>
+                <w:sz w:val="20"/>
+                <w:szCs w:val="20"/>
+              </w:rPr>
+            </w:pPr>
+          </w:p>
+          <w:p>
+            <w:pPr>
+              <w:spacing w:before="120" w:line="276" w:lineRule="auto"/>
+              <w:rPr>
+                <w:rFonts w:ascii="Arial" w:hAnsi="Arial" w:cs="Arial"/>
+                <w:sz w:val="20"/>
+                <w:szCs w:val="20"/>
+              </w:rPr>
+            </w:pPr>
+            <w:r>
+              <w:rPr>
+                <w:rFonts w:ascii="Arial" w:hAnsi="Arial" w:cs="Arial"/>
+                <w:sz w:val="20"/>
+                <w:szCs w:val="20"/>
+              </w:rPr>
+              <w:t>A continuación, desarrollé las tablas de la capa Gold, que son agregados de datos específicos para responder a preguntas de negocio. Creé tablas que resumían las ventas diarias por categoría, la segmentación de clientes y el rendimiento de las promociones. Estas tablas están altamente optimizadas para ser consultadas rápidamente por herramientas de análisis.</w:t>
+            </w:r>
+          </w:p>
+          <w:p>
+            <w:pPr>
+              <w:spacing w:before="120" w:line="276" w:lineRule="auto"/>
+              <w:rPr>
+                <w:rFonts w:ascii="Arial" w:hAnsi="Arial" w:cs="Arial"/>
+                <w:sz w:val="20"/>
+                <w:szCs w:val="20"/>
+              </w:rPr>
+            </w:pPr>
+          </w:p>
+          <w:p>
+            <w:pPr>
+              <w:spacing w:before="120" w:line="276" w:lineRule="auto"/>
+              <w:rPr>
+                <w:rFonts w:ascii="Arial" w:hAnsi="Arial" w:cs="Arial"/>
+                <w:sz w:val="20"/>
+                <w:szCs w:val="20"/>
+              </w:rPr>
+            </w:pPr>
+            <w:r>
+              <w:rPr>
+                <w:rFonts w:ascii="Arial" w:hAnsi="Arial" w:cs="Arial"/>
+                <w:sz w:val="20"/>
+                <w:szCs w:val="20"/>
+              </w:rPr>
+              <w:t xml:space="preserve">Después, conecté la capa Gold de </w:t>
+            </w:r>
+            <w:proofErr w:type="spellStart"/>
+            <w:r>
+              <w:rPr>
+                <w:rFonts w:ascii="Arial" w:hAnsi="Arial" w:cs="Arial"/>
+                <w:sz w:val="20"/>
+                <w:szCs w:val="20"/>
+              </w:rPr>
+              <w:t>Databricks</w:t>
+            </w:r>
+            <w:proofErr w:type="spellEnd"/>
+            <w:r>
+              <w:rPr>
+                <w:rFonts w:ascii="Arial" w:hAnsi="Arial" w:cs="Arial"/>
+                <w:sz w:val="20"/>
+                <w:szCs w:val="20"/>
+              </w:rPr>
+              <w:t xml:space="preserve"> con </w:t>
+            </w:r>
+            <w:proofErr w:type="spellStart"/>
+            <w:r>
+              <w:rPr>
+                <w:rFonts w:ascii="Arial" w:hAnsi="Arial" w:cs="Arial"/>
+                <w:sz w:val="20"/>
+                <w:szCs w:val="20"/>
+              </w:rPr>
+              <w:t>Power</w:t>
+            </w:r>
+            <w:proofErr w:type="spellEnd"/>
+            <w:r>
+              <w:rPr>
+                <w:rFonts w:ascii="Arial" w:hAnsi="Arial" w:cs="Arial"/>
+                <w:sz w:val="20"/>
+                <w:szCs w:val="20"/>
+              </w:rPr>
+              <w:t xml:space="preserve"> BI. Diseñé varios </w:t>
+            </w:r>
+            <w:proofErr w:type="spellStart"/>
+            <w:r>
+              <w:rPr>
+                <w:rFonts w:ascii="Arial" w:hAnsi="Arial" w:cs="Arial"/>
+                <w:sz w:val="20"/>
+                <w:szCs w:val="20"/>
+              </w:rPr>
+              <w:t>dashboards</w:t>
+            </w:r>
+            <w:proofErr w:type="spellEnd"/>
+            <w:r>
+              <w:rPr>
+                <w:rFonts w:ascii="Arial" w:hAnsi="Arial" w:cs="Arial"/>
+                <w:sz w:val="20"/>
+                <w:szCs w:val="20"/>
+              </w:rPr>
+              <w:t xml:space="preserve"> interactivos para la gerencia, incluyendo un visualizador de ventas en tiempo real, un monitor de niveles de inventario y un panel de análisis del comportamiento del cliente. Esto permite a los tomadores de decisiones explorar los datos de forma visual e intuitiva.</w:t>
+            </w:r>
+          </w:p>
+          <w:p>
+            <w:pPr>
+              <w:spacing w:before="120" w:line="276" w:lineRule="auto"/>
+              <w:rPr>
+                <w:rFonts w:ascii="Arial" w:hAnsi="Arial" w:cs="Arial"/>
+                <w:sz w:val="20"/>
+                <w:szCs w:val="20"/>
+              </w:rPr>
+            </w:pPr>
+          </w:p>
+          <w:p>
+            <w:pPr>
+              <w:spacing w:before="120" w:line="276" w:lineRule="auto"/>
+              <w:rPr>
+                <w:rFonts w:ascii="Arial" w:hAnsi="Arial" w:cs="Arial"/>
+                <w:sz w:val="20"/>
+                <w:szCs w:val="20"/>
+              </w:rPr>
+            </w:pPr>
+            <w:r>
+              <w:rPr>
+                <w:rFonts w:ascii="Arial" w:hAnsi="Arial" w:cs="Arial"/>
+                <w:sz w:val="20"/>
+                <w:szCs w:val="20"/>
+              </w:rPr>
+              <w:t>Luego, para demostrar el poder predictivo de la plataforma, implementé un modelo de análisis de la canasta de compra (</w:t>
+            </w:r>
+            <w:proofErr w:type="spellStart"/>
+            <w:r>
+              <w:rPr>
+                <w:rFonts w:ascii="Arial" w:hAnsi="Arial" w:cs="Arial"/>
+                <w:sz w:val="20"/>
+                <w:szCs w:val="20"/>
+              </w:rPr>
+              <w:t>Market</w:t>
+            </w:r>
+            <w:proofErr w:type="spellEnd"/>
+            <w:r>
+              <w:rPr>
+                <w:rFonts w:ascii="Arial" w:hAnsi="Arial" w:cs="Arial"/>
+                <w:sz w:val="20"/>
+                <w:szCs w:val="20"/>
+              </w:rPr>
+              <w:t xml:space="preserve"> </w:t>
+            </w:r>
+            <w:proofErr w:type="spellStart"/>
+            <w:r>
+              <w:rPr>
+                <w:rFonts w:ascii="Arial" w:hAnsi="Arial" w:cs="Arial"/>
+                <w:sz w:val="20"/>
+                <w:szCs w:val="20"/>
+              </w:rPr>
+              <w:t>Basket</w:t>
+            </w:r>
+            <w:proofErr w:type="spellEnd"/>
+            <w:r>
+              <w:rPr>
+                <w:rFonts w:ascii="Arial" w:hAnsi="Arial" w:cs="Arial"/>
+                <w:sz w:val="20"/>
+                <w:szCs w:val="20"/>
+              </w:rPr>
+              <w:t xml:space="preserve"> </w:t>
+            </w:r>
+            <w:proofErr w:type="spellStart"/>
+            <w:r>
+              <w:rPr>
+                <w:rFonts w:ascii="Arial" w:hAnsi="Arial" w:cs="Arial"/>
+                <w:sz w:val="20"/>
+                <w:szCs w:val="20"/>
+              </w:rPr>
+              <w:t>Analysis</w:t>
+            </w:r>
+            <w:proofErr w:type="spellEnd"/>
+            <w:r>
+              <w:rPr>
+                <w:rFonts w:ascii="Arial" w:hAnsi="Arial" w:cs="Arial"/>
+                <w:sz w:val="20"/>
+                <w:szCs w:val="20"/>
+              </w:rPr>
+              <w:t xml:space="preserve">) utilizando la librería </w:t>
+            </w:r>
+            <w:proofErr w:type="spellStart"/>
+            <w:r>
+              <w:rPr>
+                <w:rFonts w:ascii="Arial" w:hAnsi="Arial" w:cs="Arial"/>
+                <w:sz w:val="20"/>
+                <w:szCs w:val="20"/>
+              </w:rPr>
+              <w:t>MLlib</w:t>
+            </w:r>
+            <w:proofErr w:type="spellEnd"/>
+            <w:r>
+              <w:rPr>
+                <w:rFonts w:ascii="Arial" w:hAnsi="Arial" w:cs="Arial"/>
+                <w:sz w:val="20"/>
+                <w:szCs w:val="20"/>
+              </w:rPr>
+              <w:t xml:space="preserve"> de </w:t>
+            </w:r>
+            <w:proofErr w:type="spellStart"/>
+            <w:r>
+              <w:rPr>
+                <w:rFonts w:ascii="Arial" w:hAnsi="Arial" w:cs="Arial"/>
+                <w:sz w:val="20"/>
+                <w:szCs w:val="20"/>
+              </w:rPr>
+              <w:t>Spark</w:t>
+            </w:r>
+            <w:proofErr w:type="spellEnd"/>
+            <w:r>
+              <w:rPr>
+                <w:rFonts w:ascii="Arial" w:hAnsi="Arial" w:cs="Arial"/>
+                <w:sz w:val="20"/>
+                <w:szCs w:val="20"/>
+              </w:rPr>
+              <w:t xml:space="preserve">. Este modelo identifica qué productos se compran juntos con frecuencia, generando </w:t>
+            </w:r>
+            <w:proofErr w:type="spellStart"/>
+            <w:r>
+              <w:rPr>
+                <w:rFonts w:ascii="Arial" w:hAnsi="Arial" w:cs="Arial"/>
+                <w:sz w:val="20"/>
+                <w:szCs w:val="20"/>
+              </w:rPr>
+              <w:t>insights</w:t>
+            </w:r>
+            <w:proofErr w:type="spellEnd"/>
+            <w:r>
+              <w:rPr>
+                <w:rFonts w:ascii="Arial" w:hAnsi="Arial" w:cs="Arial"/>
+                <w:sz w:val="20"/>
+                <w:szCs w:val="20"/>
+              </w:rPr>
+              <w:t xml:space="preserve"> valiosos para estrategias de </w:t>
+            </w:r>
+            <w:proofErr w:type="spellStart"/>
+            <w:r>
+              <w:rPr>
+                <w:rFonts w:ascii="Arial" w:hAnsi="Arial" w:cs="Arial"/>
+                <w:sz w:val="20"/>
+                <w:szCs w:val="20"/>
+              </w:rPr>
+              <w:t>cross-selling</w:t>
+            </w:r>
+            <w:proofErr w:type="spellEnd"/>
+            <w:r>
+              <w:rPr>
+                <w:rFonts w:ascii="Arial" w:hAnsi="Arial" w:cs="Arial"/>
+                <w:sz w:val="20"/>
+                <w:szCs w:val="20"/>
+              </w:rPr>
+              <w:t xml:space="preserve"> y para la distribución de productos en la tienda.</w:t>
+            </w:r>
+          </w:p>
+          <w:p>
+            <w:pPr>
+              <w:spacing w:before="120" w:line="276" w:lineRule="auto"/>
+              <w:rPr>
+                <w:rFonts w:ascii="Arial" w:hAnsi="Arial" w:cs="Arial"/>
+                <w:sz w:val="20"/>
+                <w:szCs w:val="20"/>
+              </w:rPr>
+            </w:pPr>
+          </w:p>
+          <w:p>
+            <w:pPr>
+              <w:spacing w:before="120" w:line="276" w:lineRule="auto"/>
+              <w:rPr>
+                <w:rFonts w:ascii="Arial" w:hAnsi="Arial" w:cs="Arial"/>
+                <w:sz w:val="20"/>
+                <w:szCs w:val="20"/>
+              </w:rPr>
+            </w:pPr>
+            <w:r>
+              <w:rPr>
+                <w:rFonts w:ascii="Arial" w:hAnsi="Arial" w:cs="Arial"/>
+                <w:sz w:val="20"/>
+                <w:szCs w:val="20"/>
+              </w:rPr>
+              <w:t xml:space="preserve">Finalmente, realicé pruebas de validación de los datos en cada etapa del pipeline para asegurar la calidad y la precisión de la información. Ajusté el rendimiento de los trabajos de </w:t>
+            </w:r>
+            <w:proofErr w:type="spellStart"/>
+            <w:r>
+              <w:rPr>
+                <w:rFonts w:ascii="Arial" w:hAnsi="Arial" w:cs="Arial"/>
+                <w:sz w:val="20"/>
+                <w:szCs w:val="20"/>
+              </w:rPr>
+              <w:t>Spark</w:t>
+            </w:r>
+            <w:proofErr w:type="spellEnd"/>
+            <w:r>
+              <w:rPr>
+                <w:rFonts w:ascii="Arial" w:hAnsi="Arial" w:cs="Arial"/>
+                <w:sz w:val="20"/>
+                <w:szCs w:val="20"/>
+              </w:rPr>
+              <w:t xml:space="preserve"> y documenté todo el proceso, dejando la plataforma lista para ser utilizada por los equipos de análisis y negocio de "</w:t>
+            </w:r>
+            <w:proofErr w:type="spellStart"/>
+            <w:r>
+              <w:rPr>
+                <w:rFonts w:ascii="Arial" w:hAnsi="Arial" w:cs="Arial"/>
+                <w:sz w:val="20"/>
+                <w:szCs w:val="20"/>
+              </w:rPr>
+              <w:t>MercadoFresh</w:t>
+            </w:r>
+            <w:proofErr w:type="spellEnd"/>
+            <w:r>
+              <w:rPr>
+                <w:rFonts w:ascii="Arial" w:hAnsi="Arial" w:cs="Arial"/>
+                <w:sz w:val="20"/>
+                <w:szCs w:val="20"/>
+              </w:rPr>
+              <w:t>".</w:t>
+            </w:r>
+          </w:p>
+          <w:p>
+            <w:pPr>
+              <w:spacing w:before="120" w:line="276" w:lineRule="auto"/>
+              <w:rPr>
+                <w:rFonts w:ascii="Arial" w:hAnsi="Arial" w:cs="Arial"/>
+                <w:sz w:val="20"/>
+                <w:szCs w:val="20"/>
+              </w:rPr>
+            </w:pPr>
+            <w:r>
+              <w:rPr>
+                <w:rFonts w:ascii="Arial" w:hAnsi="Arial" w:cs="Arial"/>
+                <w:sz w:val="20"/>
+                <w:szCs w:val="20"/>
+              </w:rPr>
+              <w:t xml:space="preserve">PDTA: Para mí, el mayor desafío fue el diseño de las transformaciones de datos entre las capas Silver y Gold. Entender a fondo las necesidades del negocio para crear agregados que fueran realmente útiles y </w:t>
+            </w:r>
+            <w:proofErr w:type="spellStart"/>
+            <w:r>
+              <w:rPr>
+                <w:rFonts w:ascii="Arial" w:hAnsi="Arial" w:cs="Arial"/>
+                <w:sz w:val="20"/>
+                <w:szCs w:val="20"/>
+              </w:rPr>
+              <w:t>performantes</w:t>
+            </w:r>
+            <w:proofErr w:type="spellEnd"/>
+            <w:r>
+              <w:rPr>
+                <w:rFonts w:ascii="Arial" w:hAnsi="Arial" w:cs="Arial"/>
+                <w:sz w:val="20"/>
+                <w:szCs w:val="20"/>
+              </w:rPr>
+              <w:t xml:space="preserve"> fue un proceso complejo, ya que requería no solo dominar </w:t>
+            </w:r>
+            <w:proofErr w:type="spellStart"/>
+            <w:r>
+              <w:rPr>
+                <w:rFonts w:ascii="Arial" w:hAnsi="Arial" w:cs="Arial"/>
+                <w:sz w:val="20"/>
+                <w:szCs w:val="20"/>
+              </w:rPr>
+              <w:t>Spark</w:t>
+            </w:r>
+            <w:proofErr w:type="spellEnd"/>
+            <w:r>
+              <w:rPr>
+                <w:rFonts w:ascii="Arial" w:hAnsi="Arial" w:cs="Arial"/>
+                <w:sz w:val="20"/>
+                <w:szCs w:val="20"/>
+              </w:rPr>
+              <w:t xml:space="preserve"> y SQL, sino también pensar como un analista de </w:t>
+            </w:r>
+            <w:proofErr w:type="spellStart"/>
+            <w:r>
+              <w:rPr>
+                <w:rFonts w:ascii="Arial" w:hAnsi="Arial" w:cs="Arial"/>
+                <w:sz w:val="20"/>
+                <w:szCs w:val="20"/>
+              </w:rPr>
+              <w:t>retail</w:t>
+            </w:r>
+            <w:proofErr w:type="spellEnd"/>
+            <w:r>
+              <w:rPr>
+                <w:rFonts w:ascii="Arial" w:hAnsi="Arial" w:cs="Arial"/>
+                <w:sz w:val="20"/>
+                <w:szCs w:val="20"/>
+              </w:rPr>
+              <w:t>. Cada tabla en la capa Gold es el resultado de un análisis cuidadoso para asegurar que aporte valor estratégico.</w:t>
+            </w:r>
           </w:p>
           <w:p>
             <w:pPr>
@@ -6106,15 +7816,6 @@
           <w:szCs w:val="20"/>
         </w:rPr>
       </w:pPr>
-      <w:r>
-        <w:rPr>
-          <w:rFonts w:ascii="Arial" w:hAnsi="Arial" w:cs="Arial"/>
-          <w:b/>
-          <w:sz w:val="20"/>
-          <w:szCs w:val="20"/>
-        </w:rPr>
-        <w:br w:type="page"/>
-      </w:r>
     </w:p>
     <w:p>
       <w:pPr>
@@ -6131,7 +7832,6 @@
         <w:rPr>
           <w:noProof/>
         </w:rPr>
-        <w:lastRenderedPageBreak/>
         <mc:AlternateContent>
           <mc:Choice Requires="wps">
             <w:drawing>
@@ -6545,7 +8245,7 @@
       </w:tr>
       <w:tr>
         <w:trPr>
-          <w:trHeight w:val="425"/>
+          <w:trHeight w:val="353"/>
         </w:trPr>
         <w:tc>
           <w:tcPr>
@@ -6556,9 +8256,61 @@
             <w:pPr>
               <w:rPr>
                 <w:rFonts w:ascii="Arial" w:hAnsi="Arial" w:cs="Arial"/>
-                <w:b/>
-              </w:rPr>
-            </w:pPr>
+                <w:sz w:val="22"/>
+                <w:szCs w:val="22"/>
+              </w:rPr>
+            </w:pPr>
+            <w:r>
+              <w:rPr>
+                <w:rFonts w:ascii="Arial" w:hAnsi="Arial" w:cs="Arial"/>
+                <w:sz w:val="22"/>
+                <w:szCs w:val="22"/>
+              </w:rPr>
+              <w:t xml:space="preserve">Diseño de la Arquitectura de Datos en la Nube </w:t>
+            </w:r>
+          </w:p>
+          <w:p>
+            <w:pPr>
+              <w:rPr>
+                <w:rFonts w:ascii="Arial" w:hAnsi="Arial" w:cs="Arial"/>
+                <w:sz w:val="22"/>
+                <w:szCs w:val="22"/>
+              </w:rPr>
+            </w:pPr>
+            <w:r>
+              <w:rPr>
+                <w:rFonts w:ascii="Arial" w:hAnsi="Arial" w:cs="Arial"/>
+                <w:sz w:val="22"/>
+                <w:szCs w:val="22"/>
+              </w:rPr>
+              <w:t>(</w:t>
+            </w:r>
+            <w:proofErr w:type="spellStart"/>
+            <w:r>
+              <w:rPr>
+                <w:rFonts w:ascii="Arial" w:hAnsi="Arial" w:cs="Arial"/>
+                <w:sz w:val="22"/>
+                <w:szCs w:val="22"/>
+              </w:rPr>
+              <w:t>Lakehouse</w:t>
+            </w:r>
+            <w:proofErr w:type="spellEnd"/>
+            <w:r>
+              <w:rPr>
+                <w:rFonts w:ascii="Arial" w:hAnsi="Arial" w:cs="Arial"/>
+                <w:sz w:val="22"/>
+                <w:szCs w:val="22"/>
+              </w:rPr>
+              <w:t>)</w:t>
+            </w:r>
+            <w:r>
+              <w:rPr>
+                <w:rFonts w:ascii="Arial" w:hAnsi="Arial" w:cs="Arial"/>
+                <w:sz w:val="22"/>
+                <w:szCs w:val="22"/>
+              </w:rPr>
+              <w:tab/>
+            </w:r>
           </w:p>
         </w:tc>
         <w:tc>
@@ -6570,9 +8322,18 @@
             <w:pPr>
               <w:rPr>
                 <w:rFonts w:ascii="Arial" w:hAnsi="Arial" w:cs="Arial"/>
-                <w:b/>
-              </w:rPr>
-            </w:pPr>
+                <w:sz w:val="22"/>
+                <w:szCs w:val="22"/>
+              </w:rPr>
+            </w:pPr>
+            <w:r>
+              <w:rPr>
+                <w:rFonts w:ascii="Arial" w:hAnsi="Arial" w:cs="Arial"/>
+                <w:sz w:val="22"/>
+                <w:szCs w:val="22"/>
+              </w:rPr>
+              <w:t xml:space="preserve">Metodologías de Data Management </w:t>
+            </w:r>
           </w:p>
         </w:tc>
       </w:tr>
@@ -6589,8 +8350,44 @@
             <w:pPr>
               <w:rPr>
                 <w:rFonts w:ascii="Arial" w:hAnsi="Arial" w:cs="Arial"/>
-              </w:rPr>
-            </w:pPr>
+                <w:sz w:val="22"/>
+                <w:szCs w:val="22"/>
+              </w:rPr>
+            </w:pPr>
+            <w:r>
+              <w:rPr>
+                <w:rFonts w:ascii="Arial" w:hAnsi="Arial" w:cs="Arial"/>
+                <w:sz w:val="22"/>
+                <w:szCs w:val="22"/>
+              </w:rPr>
+              <w:t xml:space="preserve">Configuración del entorno en </w:t>
+            </w:r>
+            <w:proofErr w:type="spellStart"/>
+            <w:r>
+              <w:rPr>
+                <w:rFonts w:ascii="Arial" w:hAnsi="Arial" w:cs="Arial"/>
+                <w:sz w:val="22"/>
+                <w:szCs w:val="22"/>
+              </w:rPr>
+              <w:t>Databricks</w:t>
+            </w:r>
+            <w:proofErr w:type="spellEnd"/>
+            <w:r>
+              <w:rPr>
+                <w:rFonts w:ascii="Arial" w:hAnsi="Arial" w:cs="Arial"/>
+                <w:sz w:val="22"/>
+                <w:szCs w:val="22"/>
+              </w:rPr>
+              <w:t xml:space="preserve"> y el proveedor de nube</w:t>
+            </w:r>
+            <w:r>
+              <w:rPr>
+                <w:rFonts w:ascii="Arial" w:hAnsi="Arial" w:cs="Arial"/>
+                <w:sz w:val="22"/>
+                <w:szCs w:val="22"/>
+              </w:rPr>
+              <w:tab/>
+            </w:r>
           </w:p>
         </w:tc>
         <w:tc>
@@ -6602,8 +8399,20 @@
             <w:pPr>
               <w:rPr>
                 <w:rFonts w:ascii="Arial" w:hAnsi="Arial" w:cs="Arial"/>
-              </w:rPr>
-            </w:pPr>
+                <w:sz w:val="22"/>
+                <w:szCs w:val="22"/>
+                <w:lang w:val="en-US"/>
+              </w:rPr>
+            </w:pPr>
+            <w:r>
+              <w:rPr>
+                <w:rFonts w:ascii="Arial" w:hAnsi="Arial" w:cs="Arial"/>
+                <w:sz w:val="22"/>
+                <w:szCs w:val="22"/>
+                <w:lang w:val="en-US"/>
+              </w:rPr>
+              <w:t>AWS/Azure/GCP Well-Architected Framework</w:t>
+            </w:r>
           </w:p>
         </w:tc>
       </w:tr>
@@ -6620,8 +8429,36 @@
             <w:pPr>
               <w:rPr>
                 <w:rFonts w:ascii="Arial" w:hAnsi="Arial" w:cs="Arial"/>
-              </w:rPr>
-            </w:pPr>
+                <w:sz w:val="22"/>
+                <w:szCs w:val="22"/>
+              </w:rPr>
+            </w:pPr>
+            <w:r>
+              <w:rPr>
+                <w:rFonts w:ascii="Arial" w:hAnsi="Arial" w:cs="Arial"/>
+                <w:sz w:val="22"/>
+                <w:szCs w:val="22"/>
+              </w:rPr>
+              <w:t xml:space="preserve">Desarrollo de pipelines de ingesta de datos con Apache </w:t>
+            </w:r>
+            <w:proofErr w:type="spellStart"/>
+            <w:r>
+              <w:rPr>
+                <w:rFonts w:ascii="Arial" w:hAnsi="Arial" w:cs="Arial"/>
+                <w:sz w:val="22"/>
+                <w:szCs w:val="22"/>
+              </w:rPr>
+              <w:t>Spark</w:t>
+            </w:r>
+            <w:proofErr w:type="spellEnd"/>
+            <w:r>
+              <w:rPr>
+                <w:rFonts w:ascii="Arial" w:hAnsi="Arial" w:cs="Arial"/>
+                <w:sz w:val="22"/>
+                <w:szCs w:val="22"/>
+              </w:rPr>
+              <w:tab/>
+            </w:r>
           </w:p>
         </w:tc>
         <w:tc>
@@ -6633,8 +8470,36 @@
             <w:pPr>
               <w:rPr>
                 <w:rFonts w:ascii="Arial" w:hAnsi="Arial" w:cs="Arial"/>
-              </w:rPr>
-            </w:pPr>
+                <w:sz w:val="22"/>
+                <w:szCs w:val="22"/>
+              </w:rPr>
+            </w:pPr>
+            <w:r>
+              <w:rPr>
+                <w:rFonts w:ascii="Arial" w:hAnsi="Arial" w:cs="Arial"/>
+                <w:sz w:val="22"/>
+                <w:szCs w:val="22"/>
+              </w:rPr>
+              <w:t>Estándares de formato de datos (</w:t>
+            </w:r>
+            <w:proofErr w:type="spellStart"/>
+            <w:r>
+              <w:rPr>
+                <w:rFonts w:ascii="Arial" w:hAnsi="Arial" w:cs="Arial"/>
+                <w:sz w:val="22"/>
+                <w:szCs w:val="22"/>
+              </w:rPr>
+              <w:t>Parquet</w:t>
+            </w:r>
+            <w:proofErr w:type="spellEnd"/>
+            <w:r>
+              <w:rPr>
+                <w:rFonts w:ascii="Arial" w:hAnsi="Arial" w:cs="Arial"/>
+                <w:sz w:val="22"/>
+                <w:szCs w:val="22"/>
+              </w:rPr>
+              <w:t>, Delta Lake)</w:t>
+            </w:r>
           </w:p>
         </w:tc>
       </w:tr>
@@ -6651,8 +8516,26 @@
             <w:pPr>
               <w:rPr>
                 <w:rFonts w:ascii="Arial" w:hAnsi="Arial" w:cs="Arial"/>
-              </w:rPr>
-            </w:pPr>
+                <w:sz w:val="22"/>
+                <w:szCs w:val="22"/>
+              </w:rPr>
+            </w:pPr>
+            <w:r>
+              <w:rPr>
+                <w:rFonts w:ascii="Arial" w:hAnsi="Arial" w:cs="Arial"/>
+                <w:sz w:val="22"/>
+                <w:szCs w:val="22"/>
+              </w:rPr>
+              <w:t>Implementación de lógicas de limpieza y transformación de datos</w:t>
+            </w:r>
+            <w:r>
+              <w:rPr>
+                <w:rFonts w:ascii="Arial" w:hAnsi="Arial" w:cs="Arial"/>
+                <w:sz w:val="22"/>
+                <w:szCs w:val="22"/>
+              </w:rPr>
+              <w:tab/>
+            </w:r>
           </w:p>
         </w:tc>
         <w:tc>
@@ -6664,8 +8547,18 @@
             <w:pPr>
               <w:rPr>
                 <w:rFonts w:ascii="Arial" w:hAnsi="Arial" w:cs="Arial"/>
-              </w:rPr>
-            </w:pPr>
+                <w:sz w:val="22"/>
+                <w:szCs w:val="22"/>
+              </w:rPr>
+            </w:pPr>
+            <w:r>
+              <w:rPr>
+                <w:rFonts w:ascii="Arial" w:hAnsi="Arial" w:cs="Arial"/>
+                <w:sz w:val="22"/>
+                <w:szCs w:val="22"/>
+              </w:rPr>
+              <w:t>Norma ISO 8000 (Calidad de datos)</w:t>
+            </w:r>
           </w:p>
         </w:tc>
       </w:tr>
@@ -6682,8 +8575,26 @@
             <w:pPr>
               <w:rPr>
                 <w:rFonts w:ascii="Arial" w:hAnsi="Arial" w:cs="Arial"/>
-              </w:rPr>
-            </w:pPr>
+                <w:sz w:val="22"/>
+                <w:szCs w:val="22"/>
+              </w:rPr>
+            </w:pPr>
+            <w:r>
+              <w:rPr>
+                <w:rFonts w:ascii="Arial" w:hAnsi="Arial" w:cs="Arial"/>
+                <w:sz w:val="22"/>
+                <w:szCs w:val="22"/>
+              </w:rPr>
+              <w:t>Creación de tablas agregadas para negocio (capa Gold)</w:t>
+            </w:r>
+            <w:r>
+              <w:rPr>
+                <w:rFonts w:ascii="Arial" w:hAnsi="Arial" w:cs="Arial"/>
+                <w:sz w:val="22"/>
+                <w:szCs w:val="22"/>
+              </w:rPr>
+              <w:tab/>
+            </w:r>
           </w:p>
         </w:tc>
         <w:tc>
@@ -6695,8 +8606,18 @@
             <w:pPr>
               <w:rPr>
                 <w:rFonts w:ascii="Arial" w:hAnsi="Arial" w:cs="Arial"/>
-              </w:rPr>
-            </w:pPr>
+                <w:sz w:val="22"/>
+                <w:szCs w:val="22"/>
+              </w:rPr>
+            </w:pPr>
+            <w:r>
+              <w:rPr>
+                <w:rFonts w:ascii="Arial" w:hAnsi="Arial" w:cs="Arial"/>
+                <w:sz w:val="22"/>
+                <w:szCs w:val="22"/>
+              </w:rPr>
+              <w:t>Buenas prácticas de modelado dimensional</w:t>
+            </w:r>
           </w:p>
         </w:tc>
       </w:tr>
@@ -6713,8 +8634,26 @@
             <w:pPr>
               <w:rPr>
                 <w:rFonts w:ascii="Arial" w:hAnsi="Arial" w:cs="Arial"/>
-              </w:rPr>
-            </w:pPr>
+                <w:sz w:val="22"/>
+                <w:szCs w:val="22"/>
+              </w:rPr>
+            </w:pPr>
+            <w:r>
+              <w:rPr>
+                <w:rFonts w:ascii="Arial" w:hAnsi="Arial" w:cs="Arial"/>
+                <w:sz w:val="22"/>
+                <w:szCs w:val="22"/>
+              </w:rPr>
+              <w:t>Codificación y organización modular en notebooks (Python, SQL)</w:t>
+            </w:r>
+            <w:r>
+              <w:rPr>
+                <w:rFonts w:ascii="Arial" w:hAnsi="Arial" w:cs="Arial"/>
+                <w:sz w:val="22"/>
+                <w:szCs w:val="22"/>
+              </w:rPr>
+              <w:tab/>
+            </w:r>
           </w:p>
         </w:tc>
         <w:tc>
@@ -6726,8 +8665,18 @@
             <w:pPr>
               <w:rPr>
                 <w:rFonts w:ascii="Arial" w:hAnsi="Arial" w:cs="Arial"/>
-              </w:rPr>
-            </w:pPr>
+                <w:sz w:val="22"/>
+                <w:szCs w:val="22"/>
+              </w:rPr>
+            </w:pPr>
+            <w:r>
+              <w:rPr>
+                <w:rFonts w:ascii="Arial" w:hAnsi="Arial" w:cs="Arial"/>
+                <w:sz w:val="22"/>
+                <w:szCs w:val="22"/>
+              </w:rPr>
+              <w:t>Estándares de código (PEP 8 para Python)</w:t>
+            </w:r>
           </w:p>
         </w:tc>
       </w:tr>
@@ -6744,8 +8693,72 @@
             <w:pPr>
               <w:rPr>
                 <w:rFonts w:ascii="Arial" w:hAnsi="Arial" w:cs="Arial"/>
-              </w:rPr>
-            </w:pPr>
+                <w:sz w:val="22"/>
+                <w:szCs w:val="22"/>
+              </w:rPr>
+            </w:pPr>
+            <w:r>
+              <w:rPr>
+                <w:rFonts w:ascii="Arial" w:hAnsi="Arial" w:cs="Arial"/>
+                <w:sz w:val="22"/>
+                <w:szCs w:val="22"/>
+              </w:rPr>
+              <w:t xml:space="preserve">Conexión y diseño de </w:t>
+            </w:r>
+            <w:proofErr w:type="spellStart"/>
+            <w:r>
+              <w:rPr>
+                <w:rFonts w:ascii="Arial" w:hAnsi="Arial" w:cs="Arial"/>
+                <w:sz w:val="22"/>
+                <w:szCs w:val="22"/>
+              </w:rPr>
+              <w:t>dashboards</w:t>
+            </w:r>
+            <w:proofErr w:type="spellEnd"/>
+            <w:r>
+              <w:rPr>
+                <w:rFonts w:ascii="Arial" w:hAnsi="Arial" w:cs="Arial"/>
+                <w:sz w:val="22"/>
+                <w:szCs w:val="22"/>
+              </w:rPr>
+              <w:t xml:space="preserve"> en </w:t>
+            </w:r>
+            <w:proofErr w:type="spellStart"/>
+            <w:r>
+              <w:rPr>
+                <w:rFonts w:ascii="Arial" w:hAnsi="Arial" w:cs="Arial"/>
+                <w:sz w:val="22"/>
+                <w:szCs w:val="22"/>
+              </w:rPr>
+              <w:t>Power</w:t>
+            </w:r>
+            <w:proofErr w:type="spellEnd"/>
+            <w:r>
+              <w:rPr>
+                <w:rFonts w:ascii="Arial" w:hAnsi="Arial" w:cs="Arial"/>
+                <w:sz w:val="22"/>
+                <w:szCs w:val="22"/>
+              </w:rPr>
+              <w:t xml:space="preserve"> BI / </w:t>
+            </w:r>
+            <w:proofErr w:type="spellStart"/>
+            <w:r>
+              <w:rPr>
+                <w:rFonts w:ascii="Arial" w:hAnsi="Arial" w:cs="Arial"/>
+                <w:sz w:val="22"/>
+                <w:szCs w:val="22"/>
+              </w:rPr>
+              <w:t>Tableau</w:t>
+            </w:r>
+            <w:proofErr w:type="spellEnd"/>
+            <w:r>
+              <w:rPr>
+                <w:rFonts w:ascii="Arial" w:hAnsi="Arial" w:cs="Arial"/>
+                <w:sz w:val="22"/>
+                <w:szCs w:val="22"/>
+              </w:rPr>
+              <w:tab/>
+            </w:r>
           </w:p>
         </w:tc>
         <w:tc>
@@ -6757,8 +8770,44 @@
             <w:pPr>
               <w:rPr>
                 <w:rFonts w:ascii="Arial" w:hAnsi="Arial" w:cs="Arial"/>
-              </w:rPr>
-            </w:pPr>
+                <w:sz w:val="22"/>
+                <w:szCs w:val="22"/>
+              </w:rPr>
+            </w:pPr>
+            <w:r>
+              <w:rPr>
+                <w:rFonts w:ascii="Arial" w:hAnsi="Arial" w:cs="Arial"/>
+                <w:sz w:val="22"/>
+                <w:szCs w:val="22"/>
+              </w:rPr>
+              <w:t xml:space="preserve">Buenas prácticas de </w:t>
+            </w:r>
+            <w:proofErr w:type="spellStart"/>
+            <w:r>
+              <w:rPr>
+                <w:rFonts w:ascii="Arial" w:hAnsi="Arial" w:cs="Arial"/>
+                <w:sz w:val="22"/>
+                <w:szCs w:val="22"/>
+              </w:rPr>
+              <w:t>visualiz</w:t>
+            </w:r>
+            <w:proofErr w:type="spellEnd"/>
+            <w:r>
+              <w:rPr>
+                <w:rFonts w:ascii="Arial" w:hAnsi="Arial" w:cs="Arial"/>
+                <w:sz w:val="22"/>
+                <w:szCs w:val="22"/>
+              </w:rPr>
+              <w:t>.</w:t>
+            </w:r>
+            <w:r>
+              <w:rPr>
+                <w:rFonts w:ascii="Arial" w:hAnsi="Arial" w:cs="Arial"/>
+                <w:sz w:val="22"/>
+                <w:szCs w:val="22"/>
+              </w:rPr>
+              <w:t xml:space="preserve"> de datos y UX/UI</w:t>
+            </w:r>
           </w:p>
         </w:tc>
       </w:tr>
@@ -6775,8 +8824,26 @@
             <w:pPr>
               <w:rPr>
                 <w:rFonts w:ascii="Arial" w:hAnsi="Arial" w:cs="Arial"/>
-              </w:rPr>
-            </w:pPr>
+                <w:sz w:val="22"/>
+                <w:szCs w:val="22"/>
+              </w:rPr>
+            </w:pPr>
+            <w:r>
+              <w:rPr>
+                <w:rFonts w:ascii="Arial" w:hAnsi="Arial" w:cs="Arial"/>
+                <w:sz w:val="22"/>
+                <w:szCs w:val="22"/>
+              </w:rPr>
+              <w:t>Pruebas de calidad de datos y validación de pipelines</w:t>
+            </w:r>
+            <w:r>
+              <w:rPr>
+                <w:rFonts w:ascii="Arial" w:hAnsi="Arial" w:cs="Arial"/>
+                <w:sz w:val="22"/>
+                <w:szCs w:val="22"/>
+              </w:rPr>
+              <w:tab/>
+            </w:r>
           </w:p>
         </w:tc>
         <w:tc>
@@ -6788,8 +8855,18 @@
             <w:pPr>
               <w:rPr>
                 <w:rFonts w:ascii="Arial" w:hAnsi="Arial" w:cs="Arial"/>
-              </w:rPr>
-            </w:pPr>
+                <w:sz w:val="22"/>
+                <w:szCs w:val="22"/>
+              </w:rPr>
+            </w:pPr>
+            <w:r>
+              <w:rPr>
+                <w:rFonts w:ascii="Arial" w:hAnsi="Arial" w:cs="Arial"/>
+                <w:sz w:val="22"/>
+                <w:szCs w:val="22"/>
+              </w:rPr>
+              <w:t>Norma ISO/IEC 25012 (Calidad de Datos)</w:t>
+            </w:r>
           </w:p>
         </w:tc>
       </w:tr>
@@ -6806,8 +8883,26 @@
             <w:pPr>
               <w:rPr>
                 <w:rFonts w:ascii="Arial" w:hAnsi="Arial" w:cs="Arial"/>
-              </w:rPr>
-            </w:pPr>
+                <w:sz w:val="22"/>
+                <w:szCs w:val="22"/>
+              </w:rPr>
+            </w:pPr>
+            <w:r>
+              <w:rPr>
+                <w:rFonts w:ascii="Arial" w:hAnsi="Arial" w:cs="Arial"/>
+                <w:sz w:val="22"/>
+                <w:szCs w:val="22"/>
+              </w:rPr>
+              <w:t>Implementación de gobernanza y seguridad de datos</w:t>
+            </w:r>
+            <w:r>
+              <w:rPr>
+                <w:rFonts w:ascii="Arial" w:hAnsi="Arial" w:cs="Arial"/>
+                <w:sz w:val="22"/>
+                <w:szCs w:val="22"/>
+              </w:rPr>
+              <w:tab/>
+            </w:r>
           </w:p>
         </w:tc>
         <w:tc>
@@ -6819,8 +8914,34 @@
             <w:pPr>
               <w:rPr>
                 <w:rFonts w:ascii="Arial" w:hAnsi="Arial" w:cs="Arial"/>
-              </w:rPr>
-            </w:pPr>
+                <w:sz w:val="22"/>
+                <w:szCs w:val="22"/>
+              </w:rPr>
+            </w:pPr>
+            <w:r>
+              <w:rPr>
+                <w:rFonts w:ascii="Arial" w:hAnsi="Arial" w:cs="Arial"/>
+                <w:sz w:val="22"/>
+                <w:szCs w:val="22"/>
+              </w:rPr>
+              <w:t xml:space="preserve">GDPR / Leyes </w:t>
+            </w:r>
+            <w:r>
+              <w:rPr>
+                <w:rFonts w:ascii="Arial" w:hAnsi="Arial" w:cs="Arial"/>
+                <w:sz w:val="22"/>
+                <w:szCs w:val="22"/>
+              </w:rPr>
+              <w:t xml:space="preserve">d’ </w:t>
+            </w:r>
+            <w:r>
+              <w:rPr>
+                <w:rFonts w:ascii="Arial" w:hAnsi="Arial" w:cs="Arial"/>
+                <w:sz w:val="22"/>
+                <w:szCs w:val="22"/>
+              </w:rPr>
+              <w:t>Protección de Datos Personales</w:t>
+            </w:r>
           </w:p>
         </w:tc>
       </w:tr>
@@ -6837,8 +8958,44 @@
             <w:pPr>
               <w:rPr>
                 <w:rFonts w:ascii="Arial" w:hAnsi="Arial" w:cs="Arial"/>
-              </w:rPr>
-            </w:pPr>
+                <w:sz w:val="22"/>
+                <w:szCs w:val="22"/>
+              </w:rPr>
+            </w:pPr>
+            <w:r>
+              <w:rPr>
+                <w:rFonts w:ascii="Arial" w:hAnsi="Arial" w:cs="Arial"/>
+                <w:sz w:val="22"/>
+                <w:szCs w:val="22"/>
+              </w:rPr>
+              <w:t xml:space="preserve">Implementación de modelo de Machine </w:t>
+            </w:r>
+            <w:proofErr w:type="spellStart"/>
+            <w:r>
+              <w:rPr>
+                <w:rFonts w:ascii="Arial" w:hAnsi="Arial" w:cs="Arial"/>
+                <w:sz w:val="22"/>
+                <w:szCs w:val="22"/>
+              </w:rPr>
+              <w:t>Learning</w:t>
+            </w:r>
+            <w:proofErr w:type="spellEnd"/>
+            <w:r>
+              <w:rPr>
+                <w:rFonts w:ascii="Arial" w:hAnsi="Arial" w:cs="Arial"/>
+                <w:sz w:val="22"/>
+                <w:szCs w:val="22"/>
+              </w:rPr>
+              <w:t xml:space="preserve"> (Análisis de Canasta)</w:t>
+            </w:r>
+            <w:r>
+              <w:rPr>
+                <w:rFonts w:ascii="Arial" w:hAnsi="Arial" w:cs="Arial"/>
+                <w:sz w:val="22"/>
+                <w:szCs w:val="22"/>
+              </w:rPr>
+              <w:tab/>
+            </w:r>
           </w:p>
         </w:tc>
         <w:tc>
@@ -6850,8 +9007,18 @@
             <w:pPr>
               <w:rPr>
                 <w:rFonts w:ascii="Arial" w:hAnsi="Arial" w:cs="Arial"/>
-              </w:rPr>
-            </w:pPr>
+                <w:sz w:val="22"/>
+                <w:szCs w:val="22"/>
+              </w:rPr>
+            </w:pPr>
+            <w:r>
+              <w:rPr>
+                <w:rFonts w:ascii="Arial" w:hAnsi="Arial" w:cs="Arial"/>
+                <w:sz w:val="22"/>
+                <w:szCs w:val="22"/>
+              </w:rPr>
+              <w:t>Metodología CRISP-DM para minería de datos</w:t>
+            </w:r>
           </w:p>
         </w:tc>
       </w:tr>
@@ -6868,8 +9035,36 @@
             <w:pPr>
               <w:rPr>
                 <w:rFonts w:ascii="Arial" w:hAnsi="Arial" w:cs="Arial"/>
-              </w:rPr>
-            </w:pPr>
+                <w:sz w:val="22"/>
+                <w:szCs w:val="22"/>
+              </w:rPr>
+            </w:pPr>
+            <w:r>
+              <w:rPr>
+                <w:rFonts w:ascii="Arial" w:hAnsi="Arial" w:cs="Arial"/>
+                <w:sz w:val="22"/>
+                <w:szCs w:val="22"/>
+              </w:rPr>
+              <w:t xml:space="preserve">Asegurar la eficiencia de recursos en la nube (Cloud </w:t>
+            </w:r>
+            <w:proofErr w:type="spellStart"/>
+            <w:r>
+              <w:rPr>
+                <w:rFonts w:ascii="Arial" w:hAnsi="Arial" w:cs="Arial"/>
+                <w:sz w:val="22"/>
+                <w:szCs w:val="22"/>
+              </w:rPr>
+              <w:t>FinOps</w:t>
+            </w:r>
+            <w:proofErr w:type="spellEnd"/>
+            <w:r>
+              <w:rPr>
+                <w:rFonts w:ascii="Arial" w:hAnsi="Arial" w:cs="Arial"/>
+                <w:sz w:val="22"/>
+                <w:szCs w:val="22"/>
+              </w:rPr>
+              <w:t>)</w:t>
+            </w:r>
           </w:p>
         </w:tc>
         <w:tc>
@@ -6881,8 +9076,18 @@
             <w:pPr>
               <w:rPr>
                 <w:rFonts w:ascii="Arial" w:hAnsi="Arial" w:cs="Arial"/>
-              </w:rPr>
-            </w:pPr>
+                <w:sz w:val="22"/>
+                <w:szCs w:val="22"/>
+              </w:rPr>
+            </w:pPr>
+            <w:r>
+              <w:rPr>
+                <w:rFonts w:ascii="Arial" w:hAnsi="Arial" w:cs="Arial"/>
+                <w:sz w:val="22"/>
+                <w:szCs w:val="22"/>
+              </w:rPr>
+              <w:t>Prácticas de Green IT (optimización de consumo)</w:t>
+            </w:r>
           </w:p>
         </w:tc>
       </w:tr>
@@ -6899,8 +9104,36 @@
             <w:pPr>
               <w:rPr>
                 <w:rFonts w:ascii="Arial" w:hAnsi="Arial" w:cs="Arial"/>
-              </w:rPr>
-            </w:pPr>
+                <w:sz w:val="22"/>
+                <w:szCs w:val="22"/>
+              </w:rPr>
+            </w:pPr>
+            <w:r>
+              <w:rPr>
+                <w:rFonts w:ascii="Arial" w:hAnsi="Arial" w:cs="Arial"/>
+                <w:sz w:val="22"/>
+                <w:szCs w:val="22"/>
+              </w:rPr>
+              <w:t xml:space="preserve">Capacitación al personal sobre uso de la plataforma y </w:t>
+            </w:r>
+            <w:proofErr w:type="spellStart"/>
+            <w:r>
+              <w:rPr>
+                <w:rFonts w:ascii="Arial" w:hAnsi="Arial" w:cs="Arial"/>
+                <w:sz w:val="22"/>
+                <w:szCs w:val="22"/>
+              </w:rPr>
+              <w:t>dashboards</w:t>
+            </w:r>
+            <w:proofErr w:type="spellEnd"/>
+            <w:r>
+              <w:rPr>
+                <w:rFonts w:ascii="Arial" w:hAnsi="Arial" w:cs="Arial"/>
+                <w:sz w:val="22"/>
+                <w:szCs w:val="22"/>
+              </w:rPr>
+              <w:tab/>
+            </w:r>
           </w:p>
         </w:tc>
         <w:tc>
@@ -6912,6 +9145,8 @@
             <w:pPr>
               <w:rPr>
                 <w:rFonts w:ascii="Arial" w:hAnsi="Arial" w:cs="Arial"/>
+                <w:sz w:val="22"/>
+                <w:szCs w:val="22"/>
               </w:rPr>
             </w:pPr>
           </w:p>
@@ -6930,8 +9165,26 @@
             <w:pPr>
               <w:rPr>
                 <w:rFonts w:ascii="Arial" w:hAnsi="Arial" w:cs="Arial"/>
-              </w:rPr>
-            </w:pPr>
+                <w:sz w:val="22"/>
+                <w:szCs w:val="22"/>
+              </w:rPr>
+            </w:pPr>
+            <w:r>
+              <w:rPr>
+                <w:rFonts w:ascii="Arial" w:hAnsi="Arial" w:cs="Arial"/>
+                <w:sz w:val="22"/>
+                <w:szCs w:val="22"/>
+              </w:rPr>
+              <w:t>Control de versiones del código con Git y repositorios</w:t>
+            </w:r>
+            <w:r>
+              <w:rPr>
+                <w:rFonts w:ascii="Arial" w:hAnsi="Arial" w:cs="Arial"/>
+                <w:sz w:val="22"/>
+                <w:szCs w:val="22"/>
+              </w:rPr>
+              <w:tab/>
+            </w:r>
           </w:p>
         </w:tc>
         <w:tc>
@@ -6943,6 +9196,8 @@
             <w:pPr>
               <w:rPr>
                 <w:rFonts w:ascii="Arial" w:hAnsi="Arial" w:cs="Arial"/>
+                <w:sz w:val="22"/>
+                <w:szCs w:val="22"/>
               </w:rPr>
             </w:pPr>
           </w:p>
@@ -6961,8 +9216,26 @@
             <w:pPr>
               <w:rPr>
                 <w:rFonts w:ascii="Arial" w:hAnsi="Arial" w:cs="Arial"/>
-              </w:rPr>
-            </w:pPr>
+                <w:sz w:val="22"/>
+                <w:szCs w:val="22"/>
+              </w:rPr>
+            </w:pPr>
+            <w:r>
+              <w:rPr>
+                <w:rFonts w:ascii="Arial" w:hAnsi="Arial" w:cs="Arial"/>
+                <w:sz w:val="22"/>
+                <w:szCs w:val="22"/>
+              </w:rPr>
+              <w:t>Documentación de la arquitectura y los procesos desarrollados</w:t>
+            </w:r>
+            <w:r>
+              <w:rPr>
+                <w:rFonts w:ascii="Arial" w:hAnsi="Arial" w:cs="Arial"/>
+                <w:sz w:val="22"/>
+                <w:szCs w:val="22"/>
+              </w:rPr>
+              <w:tab/>
+            </w:r>
           </w:p>
         </w:tc>
         <w:tc>
@@ -6974,6 +9247,8 @@
             <w:pPr>
               <w:rPr>
                 <w:rFonts w:ascii="Arial" w:hAnsi="Arial" w:cs="Arial"/>
+                <w:sz w:val="22"/>
+                <w:szCs w:val="22"/>
               </w:rPr>
             </w:pPr>
           </w:p>
@@ -6992,6 +9267,8 @@
             <w:pPr>
               <w:rPr>
                 <w:rFonts w:ascii="Arial" w:hAnsi="Arial" w:cs="Arial"/>
+                <w:sz w:val="22"/>
+                <w:szCs w:val="22"/>
               </w:rPr>
             </w:pPr>
           </w:p>
@@ -7005,6 +9282,8 @@
             <w:pPr>
               <w:rPr>
                 <w:rFonts w:ascii="Arial" w:hAnsi="Arial" w:cs="Arial"/>
+                <w:sz w:val="22"/>
+                <w:szCs w:val="22"/>
               </w:rPr>
             </w:pPr>
           </w:p>
@@ -7023,6 +9302,8 @@
             <w:pPr>
               <w:rPr>
                 <w:rFonts w:ascii="Arial" w:hAnsi="Arial" w:cs="Arial"/>
+                <w:sz w:val="22"/>
+                <w:szCs w:val="22"/>
               </w:rPr>
             </w:pPr>
           </w:p>
@@ -7036,6 +9317,8 @@
             <w:pPr>
               <w:rPr>
                 <w:rFonts w:ascii="Arial" w:hAnsi="Arial" w:cs="Arial"/>
+                <w:sz w:val="22"/>
+                <w:szCs w:val="22"/>
               </w:rPr>
             </w:pPr>
           </w:p>
@@ -7054,6 +9337,8 @@
             <w:pPr>
               <w:rPr>
                 <w:rFonts w:ascii="Arial" w:hAnsi="Arial" w:cs="Arial"/>
+                <w:sz w:val="22"/>
+                <w:szCs w:val="22"/>
               </w:rPr>
             </w:pPr>
           </w:p>
@@ -7067,6 +9352,8 @@
             <w:pPr>
               <w:rPr>
                 <w:rFonts w:ascii="Arial" w:hAnsi="Arial" w:cs="Arial"/>
+                <w:sz w:val="22"/>
+                <w:szCs w:val="22"/>
               </w:rPr>
             </w:pPr>
           </w:p>
@@ -7085,6 +9372,8 @@
             <w:pPr>
               <w:rPr>
                 <w:rFonts w:ascii="Arial" w:hAnsi="Arial" w:cs="Arial"/>
+                <w:sz w:val="22"/>
+                <w:szCs w:val="22"/>
               </w:rPr>
             </w:pPr>
           </w:p>
@@ -7098,6 +9387,8 @@
             <w:pPr>
               <w:rPr>
                 <w:rFonts w:ascii="Arial" w:hAnsi="Arial" w:cs="Arial"/>
+                <w:sz w:val="22"/>
+                <w:szCs w:val="22"/>
               </w:rPr>
             </w:pPr>
           </w:p>
@@ -7116,6 +9407,8 @@
             <w:pPr>
               <w:rPr>
                 <w:rFonts w:ascii="Arial" w:hAnsi="Arial" w:cs="Arial"/>
+                <w:sz w:val="22"/>
+                <w:szCs w:val="22"/>
               </w:rPr>
             </w:pPr>
           </w:p>
@@ -7129,37 +9422,8 @@
             <w:pPr>
               <w:rPr>
                 <w:rFonts w:ascii="Arial" w:hAnsi="Arial" w:cs="Arial"/>
-              </w:rPr>
-            </w:pPr>
-          </w:p>
-        </w:tc>
-      </w:tr>
-      <w:tr>
-        <w:trPr>
-          <w:trHeight w:val="425"/>
-        </w:trPr>
-        <w:tc>
-          <w:tcPr>
-            <w:tcW w:w="6237" w:type="dxa"/>
-            <w:vAlign w:val="center"/>
-          </w:tcPr>
-          <w:p>
-            <w:pPr>
-              <w:rPr>
-                <w:rFonts w:ascii="Arial" w:hAnsi="Arial" w:cs="Arial"/>
-              </w:rPr>
-            </w:pPr>
-          </w:p>
-        </w:tc>
-        <w:tc>
-          <w:tcPr>
-            <w:tcW w:w="2977" w:type="dxa"/>
-            <w:vAlign w:val="center"/>
-          </w:tcPr>
-          <w:p>
-            <w:pPr>
-              <w:rPr>
-                <w:rFonts w:ascii="Arial" w:hAnsi="Arial" w:cs="Arial"/>
+                <w:sz w:val="22"/>
+                <w:szCs w:val="22"/>
               </w:rPr>
             </w:pPr>
           </w:p>
@@ -7178,15 +9442,6 @@
           <w:szCs w:val="20"/>
         </w:rPr>
       </w:pPr>
-      <w:r>
-        <w:rPr>
-          <w:rFonts w:ascii="Arial" w:hAnsi="Arial" w:cs="Arial"/>
-          <w:b/>
-          <w:sz w:val="20"/>
-          <w:szCs w:val="20"/>
-        </w:rPr>
-        <w:br w:type="page"/>
-      </w:r>
     </w:p>
     <w:tbl>
       <w:tblPr>
@@ -7196,9 +9451,9 @@
         <w:tblLook w:val="04A0" w:firstRow="1" w:lastRow="0" w:firstColumn="1" w:lastColumn="0" w:noHBand="0" w:noVBand="1"/>
       </w:tblPr>
       <w:tblGrid>
-        <w:gridCol w:w="1838"/>
-        <w:gridCol w:w="6237"/>
-        <w:gridCol w:w="1418"/>
+        <w:gridCol w:w="1783"/>
+        <w:gridCol w:w="6188"/>
+        <w:gridCol w:w="1785"/>
       </w:tblGrid>
       <w:tr>
         <w:trPr>
@@ -7216,6 +9471,70 @@
                 <w:rFonts w:ascii="Arial" w:hAnsi="Arial" w:cs="Arial"/>
               </w:rPr>
             </w:pPr>
+            <w:r>
+              <w:rPr>
+                <w:noProof/>
+              </w:rPr>
+              <w:drawing>
+                <wp:anchor distT="0" distB="0" distL="114300" distR="114300" simplePos="0" relativeHeight="251711488" behindDoc="0" locked="0" layoutInCell="1" allowOverlap="1" wp14:anchorId="531D879F" wp14:editId="0F3C9264">
+                  <wp:simplePos x="0" y="0"/>
+                  <wp:positionH relativeFrom="margin">
+                    <wp:posOffset>27940</wp:posOffset>
+                  </wp:positionH>
+                  <wp:positionV relativeFrom="margin">
+                    <wp:posOffset>724535</wp:posOffset>
+                  </wp:positionV>
+                  <wp:extent cx="6048375" cy="6097905"/>
+                  <wp:effectExtent l="0" t="0" r="9525" b="0"/>
+                  <wp:wrapSquare wrapText="bothSides"/>
+                  <wp:docPr id="1" name="Imagen 1"/>
+                  <wp:cNvGraphicFramePr>
+                    <a:graphicFrameLocks xmlns:a="http://schemas.openxmlformats.org/drawingml/2006/main" noChangeAspect="1"/>
+                  </wp:cNvGraphicFramePr>
+                  <a:graphic xmlns:a="http://schemas.openxmlformats.org/drawingml/2006/main">
+                    <a:graphicData uri="http://schemas.openxmlformats.org/drawingml/2006/picture">
+                      <pic:pic xmlns:pic="http://schemas.openxmlformats.org/drawingml/2006/picture">
+                        <pic:nvPicPr>
+                          <pic:cNvPr id="0" name="Picture 1"/>
+                          <pic:cNvPicPr>
+                            <a:picLocks noChangeAspect="1" noChangeArrowheads="1"/>
+                          </pic:cNvPicPr>
+                        </pic:nvPicPr>
+                        <pic:blipFill>
+                          <a:blip r:embed="rId16">
+                            <a:extLst>
+                              <a:ext uri="{28A0092B-C50C-407E-A947-70E740481C1C}">
+                                <a14:useLocalDpi xmlns:a14="http://schemas.microsoft.com/office/drawing/2010/main" val="0"/>
+                              </a:ext>
+                            </a:extLst>
+                          </a:blip>
+                          <a:srcRect/>
+                          <a:stretch>
+                            <a:fillRect/>
+                          </a:stretch>
+                        </pic:blipFill>
+                        <pic:spPr bwMode="auto">
+                          <a:xfrm>
+                            <a:off x="0" y="0"/>
+                            <a:ext cx="6048375" cy="6097905"/>
+                          </a:xfrm>
+                          <a:prstGeom prst="rect">
+                            <a:avLst/>
+                          </a:prstGeom>
+                          <a:noFill/>
+                          <a:ln>
+                            <a:noFill/>
+                          </a:ln>
+                        </pic:spPr>
+                      </pic:pic>
+                    </a:graphicData>
+                  </a:graphic>
+                  <wp14:sizeRelH relativeFrom="margin">
+                    <wp14:pctWidth>0</wp14:pctWidth>
+                  </wp14:sizeRelH>
+                </wp:anchor>
+              </w:drawing>
+            </w:r>
           </w:p>
         </w:tc>
       </w:tr>
@@ -7267,7 +9586,7 @@
                           </pic:cNvPicPr>
                         </pic:nvPicPr>
                         <pic:blipFill>
-                          <a:blip r:embed="rId15" cstate="print">
+                          <a:blip r:embed="rId17" cstate="print">
                             <a:extLst>
                               <a:ext uri="{28A0092B-C50C-407E-A947-70E740481C1C}">
                                 <a14:useLocalDpi xmlns:a14="http://schemas.microsoft.com/office/drawing/2010/main" val="0"/>
@@ -7335,7 +9654,7 @@
                 <w:color w:val="BFBFBF" w:themeColor="background1" w:themeShade="BF"/>
                 <w:sz w:val="22"/>
               </w:rPr>
-              <w:t>NOMBRE DEL TEMA DEL TRABAJO FINAL</w:t>
+              <w:t>Arquitectura General de la Solución de Big Data</w:t>
             </w:r>
             <w:r>
               <w:rPr>
@@ -7788,7 +10107,6 @@
         <w:rPr>
           <w:noProof/>
         </w:rPr>
-        <w:lastRenderedPageBreak/>
         <mc:AlternateContent>
           <mc:Choice Requires="wps">
             <w:drawing>
@@ -10317,7 +12635,7 @@
                     </pic:cNvPicPr>
                   </pic:nvPicPr>
                   <pic:blipFill>
-                    <a:blip r:embed="rId16" cstate="print">
+                    <a:blip r:embed="rId18" cstate="print">
                       <a:extLst>
                         <a:ext uri="{28A0092B-C50C-407E-A947-70E740481C1C}">
                           <a14:useLocalDpi xmlns:a14="http://schemas.microsoft.com/office/drawing/2010/main" val="0"/>
@@ -10356,8 +12674,8 @@
       </w:r>
     </w:p>
     <w:sectPr>
-      <w:headerReference w:type="default" r:id="rId17"/>
-      <w:footerReference w:type="default" r:id="rId18"/>
+      <w:headerReference w:type="default" r:id="rId19"/>
+      <w:footerReference w:type="default" r:id="rId20"/>
       <w:pgSz w:w="11906" w:h="16838"/>
       <w:pgMar w:top="1418" w:right="1701" w:bottom="249" w:left="1418" w:header="709" w:footer="709" w:gutter="0"/>
       <w:cols w:space="708"/>
@@ -12960,6 +15278,38 @@
 </file>
 
 <file path=customXml/item1.xml><?xml version="1.0" encoding="utf-8"?>
+<?mso-contentType ?>
+<FormTemplates xmlns="http://schemas.microsoft.com/sharepoint/v3/contenttype/forms">
+  <Display>DocumentLibraryForm</Display>
+  <Edit>DocumentLibraryForm</Edit>
+  <New>DocumentLibraryForm</New>
+</FormTemplates>
+</file>
+
+<file path=customXml/item2.xml><?xml version="1.0" encoding="utf-8"?>
+<p:properties xmlns:p="http://schemas.microsoft.com/office/2006/metadata/properties" xmlns:xsi="http://www.w3.org/2001/XMLSchema-instance" xmlns:pc="http://schemas.microsoft.com/office/infopath/2007/PartnerControls">
+  <documentManagement>
+    <TaxCatchAll xmlns="ee27a0f9-7ff9-4c05-b61a-f7053cc3ff56" xsi:nil="true"/>
+    <lcf76f155ced4ddcb4097134ff3c332f xmlns="8b0498ea-4bc6-4676-a87b-9cffe7f59fc7">
+      <Terms xmlns="http://schemas.microsoft.com/office/infopath/2007/PartnerControls"/>
+    </lcf76f155ced4ddcb4097134ff3c332f>
+    <Entregado xmlns="8b0498ea-4bc6-4676-a87b-9cffe7f59fc7">false</Entregado>
+    <Tarea3 xmlns="8b0498ea-4bc6-4676-a87b-9cffe7f59fc7" xsi:nil="true"/>
+    <NumTareas xmlns="8b0498ea-4bc6-4676-a87b-9cffe7f59fc7" xsi:nil="true"/>
+    <FECHAYHORA xmlns="8b0498ea-4bc6-4676-a87b-9cffe7f59fc7" xsi:nil="true"/>
+    <Observado xmlns="8b0498ea-4bc6-4676-a87b-9cffe7f59fc7">false</Observado>
+    <SharedWithUsers xmlns="ee27a0f9-7ff9-4c05-b61a-f7053cc3ff56">
+      <UserInfo>
+        <DisplayName/>
+        <AccountId xsi:nil="true"/>
+        <AccountType/>
+      </UserInfo>
+    </SharedWithUsers>
+  </documentManagement>
+</p:properties>
+</file>
+
+<file path=customXml/item3.xml><?xml version="1.0" encoding="utf-8"?>
 <ct:contentTypeSchema xmlns:ct="http://schemas.microsoft.com/office/2006/metadata/contentType" xmlns:ma="http://schemas.microsoft.com/office/2006/metadata/properties/metaAttributes" ct:_="" ma:_="" ma:contentTypeName="Document" ma:contentTypeID="0x010100795EFC9A07ECD140851F1B2ABF131888" ma:contentTypeVersion="42" ma:contentTypeDescription="Create a new document." ma:contentTypeScope="" ma:versionID="68705ce6714181f4c3a7778789206999">
   <xsd:schema xmlns:xsd="http://www.w3.org/2001/XMLSchema" xmlns:xs="http://www.w3.org/2001/XMLSchema" xmlns:p="http://schemas.microsoft.com/office/2006/metadata/properties" xmlns:ns2="8b0498ea-4bc6-4676-a87b-9cffe7f59fc7" xmlns:ns3="ee27a0f9-7ff9-4c05-b61a-f7053cc3ff56" targetNamespace="http://schemas.microsoft.com/office/2006/metadata/properties" ma:root="true" ma:fieldsID="837849ccf018e896f9c9e07cfaff02ef" ns2:_="" ns3:_="">
     <xsd:import namespace="8b0498ea-4bc6-4676-a87b-9cffe7f59fc7"/>
@@ -13255,43 +15605,30 @@
 </ct:contentTypeSchema>
 </file>
 
-<file path=customXml/item2.xml><?xml version="1.0" encoding="utf-8"?>
-<?mso-contentType ?>
-<FormTemplates xmlns="http://schemas.microsoft.com/sharepoint/v3/contenttype/forms">
-  <Display>DocumentLibraryForm</Display>
-  <Edit>DocumentLibraryForm</Edit>
-  <New>DocumentLibraryForm</New>
-</FormTemplates>
-</file>
-
-<file path=customXml/item3.xml><?xml version="1.0" encoding="utf-8"?>
-<p:properties xmlns:p="http://schemas.microsoft.com/office/2006/metadata/properties" xmlns:xsi="http://www.w3.org/2001/XMLSchema-instance" xmlns:pc="http://schemas.microsoft.com/office/infopath/2007/PartnerControls">
-  <documentManagement>
-    <TaxCatchAll xmlns="ee27a0f9-7ff9-4c05-b61a-f7053cc3ff56" xsi:nil="true"/>
-    <lcf76f155ced4ddcb4097134ff3c332f xmlns="8b0498ea-4bc6-4676-a87b-9cffe7f59fc7">
-      <Terms xmlns="http://schemas.microsoft.com/office/infopath/2007/PartnerControls"/>
-    </lcf76f155ced4ddcb4097134ff3c332f>
-    <Entregado xmlns="8b0498ea-4bc6-4676-a87b-9cffe7f59fc7">false</Entregado>
-    <Tarea3 xmlns="8b0498ea-4bc6-4676-a87b-9cffe7f59fc7" xsi:nil="true"/>
-    <NumTareas xmlns="8b0498ea-4bc6-4676-a87b-9cffe7f59fc7" xsi:nil="true"/>
-    <FECHAYHORA xmlns="8b0498ea-4bc6-4676-a87b-9cffe7f59fc7" xsi:nil="true"/>
-    <Observado xmlns="8b0498ea-4bc6-4676-a87b-9cffe7f59fc7">false</Observado>
-    <SharedWithUsers xmlns="ee27a0f9-7ff9-4c05-b61a-f7053cc3ff56">
-      <UserInfo>
-        <DisplayName/>
-        <AccountId xsi:nil="true"/>
-        <AccountType/>
-      </UserInfo>
-    </SharedWithUsers>
-  </documentManagement>
-</p:properties>
-</file>
-
 <file path=customXml/item4.xml><?xml version="1.0" encoding="utf-8"?>
 <b:Sources xmlns:b="http://schemas.openxmlformats.org/officeDocument/2006/bibliography" xmlns="http://schemas.openxmlformats.org/officeDocument/2006/bibliography" SelectedStyle="\APA.XSL" StyleName="APA"/>
 </file>
 
 <file path=customXml/itemProps1.xml><?xml version="1.0" encoding="utf-8"?>
+<ds:datastoreItem xmlns:ds="http://schemas.openxmlformats.org/officeDocument/2006/customXml" ds:itemID="{04A08A2F-85C4-4058-B79A-F3E79FBC01F5}">
+  <ds:schemaRefs>
+    <ds:schemaRef ds:uri="http://schemas.microsoft.com/sharepoint/v3/contenttype/forms"/>
+  </ds:schemaRefs>
+</ds:datastoreItem>
+</file>
+
+<file path=customXml/itemProps2.xml><?xml version="1.0" encoding="utf-8"?>
+<ds:datastoreItem xmlns:ds="http://schemas.openxmlformats.org/officeDocument/2006/customXml" ds:itemID="{BF77E685-4CE1-49EA-B15D-526260D8588E}">
+  <ds:schemaRefs>
+    <ds:schemaRef ds:uri="http://schemas.microsoft.com/office/2006/metadata/properties"/>
+    <ds:schemaRef ds:uri="http://schemas.microsoft.com/office/infopath/2007/PartnerControls"/>
+    <ds:schemaRef ds:uri="ee27a0f9-7ff9-4c05-b61a-f7053cc3ff56"/>
+    <ds:schemaRef ds:uri="8b0498ea-4bc6-4676-a87b-9cffe7f59fc7"/>
+  </ds:schemaRefs>
+</ds:datastoreItem>
+</file>
+
+<file path=customXml/itemProps3.xml><?xml version="1.0" encoding="utf-8"?>
 <ds:datastoreItem xmlns:ds="http://schemas.openxmlformats.org/officeDocument/2006/customXml" ds:itemID="{5A632AF9-A9DA-4C5B-AE0A-CE3748046D44}">
   <ds:schemaRefs>
     <ds:schemaRef ds:uri="http://schemas.microsoft.com/office/2006/metadata/contentType"/>
@@ -13310,27 +15647,8 @@
 </ds:datastoreItem>
 </file>
 
-<file path=customXml/itemProps2.xml><?xml version="1.0" encoding="utf-8"?>
-<ds:datastoreItem xmlns:ds="http://schemas.openxmlformats.org/officeDocument/2006/customXml" ds:itemID="{04A08A2F-85C4-4058-B79A-F3E79FBC01F5}">
-  <ds:schemaRefs>
-    <ds:schemaRef ds:uri="http://schemas.microsoft.com/sharepoint/v3/contenttype/forms"/>
-  </ds:schemaRefs>
-</ds:datastoreItem>
-</file>
-
-<file path=customXml/itemProps3.xml><?xml version="1.0" encoding="utf-8"?>
-<ds:datastoreItem xmlns:ds="http://schemas.openxmlformats.org/officeDocument/2006/customXml" ds:itemID="{BF77E685-4CE1-49EA-B15D-526260D8588E}">
-  <ds:schemaRefs>
-    <ds:schemaRef ds:uri="http://schemas.microsoft.com/office/2006/metadata/properties"/>
-    <ds:schemaRef ds:uri="http://schemas.microsoft.com/office/infopath/2007/PartnerControls"/>
-    <ds:schemaRef ds:uri="ee27a0f9-7ff9-4c05-b61a-f7053cc3ff56"/>
-    <ds:schemaRef ds:uri="8b0498ea-4bc6-4676-a87b-9cffe7f59fc7"/>
-  </ds:schemaRefs>
-</ds:datastoreItem>
-</file>
-
 <file path=customXml/itemProps4.xml><?xml version="1.0" encoding="utf-8"?>
-<ds:datastoreItem xmlns:ds="http://schemas.openxmlformats.org/officeDocument/2006/customXml" ds:itemID="{D5F5289B-A6A5-4F90-B3EC-62DFE66CE97A}">
+<ds:datastoreItem xmlns:ds="http://schemas.openxmlformats.org/officeDocument/2006/customXml" ds:itemID="{40EF7CFB-DF63-4A96-A4C5-34371574E2CE}">
   <ds:schemaRefs>
     <ds:schemaRef ds:uri="http://schemas.openxmlformats.org/officeDocument/2006/bibliography"/>
   </ds:schemaRefs>

</xml_diff>